<commit_message>
Batch 19 — v2.1 classifier-corrected panel rerun (v1.0.0-rc3): manuscript/supplement/Table_S5_jackknife.docx
</commit_message>
<xml_diff>
--- a/manuscript/supplement/Table_S5_jackknife.docx
+++ b/manuscript/supplement/Table_S5_jackknife.docx
@@ -418,7 +418,7 @@
                 <w:rFonts w:ascii="Arial" w:hAnsi="Arial"/>
                 <w:sz w:val="20"/>
               </w:rPr>
-              <w:t>+15.289</w:t>
+              <w:t>+15.218</w:t>
             </w:r>
           </w:p>
         </w:tc>
@@ -432,7 +432,7 @@
                 <w:rFonts w:ascii="Arial" w:hAnsi="Arial"/>
                 <w:sz w:val="20"/>
               </w:rPr>
-              <w:t>76.1</w:t>
+              <w:t>76.4</w:t>
             </w:r>
           </w:p>
         </w:tc>
@@ -504,7 +504,7 @@
                 <w:rFonts w:ascii="Arial" w:hAnsi="Arial"/>
                 <w:sz w:val="20"/>
               </w:rPr>
-              <w:t>-3.587</w:t>
+              <w:t>-3.623</w:t>
             </w:r>
           </w:p>
         </w:tc>
@@ -518,7 +518,7 @@
                 <w:rFonts w:ascii="Arial" w:hAnsi="Arial"/>
                 <w:sz w:val="20"/>
               </w:rPr>
-              <w:t>55.8</w:t>
+              <w:t>55.5</w:t>
             </w:r>
           </w:p>
         </w:tc>
@@ -590,7 +590,7 @@
                 <w:rFonts w:ascii="Arial" w:hAnsi="Arial"/>
                 <w:sz w:val="20"/>
               </w:rPr>
-              <w:t>-0.000</w:t>
+              <w:t>-0.098</w:t>
             </w:r>
           </w:p>
         </w:tc>
@@ -604,7 +604,7 @@
                 <w:rFonts w:ascii="Arial" w:hAnsi="Arial"/>
                 <w:sz w:val="20"/>
               </w:rPr>
-              <w:t>nan</w:t>
+              <w:t>40.7</w:t>
             </w:r>
           </w:p>
         </w:tc>
@@ -618,7 +618,7 @@
                 <w:rFonts w:ascii="Arial" w:hAnsi="Arial"/>
                 <w:sz w:val="20"/>
               </w:rPr>
-              <w:t>Angul</w:t>
+              <w:t>Baleshwar</w:t>
             </w:r>
           </w:p>
         </w:tc>
@@ -632,7 +632,7 @@
                 <w:rFonts w:ascii="Arial" w:hAnsi="Arial"/>
                 <w:sz w:val="20"/>
               </w:rPr>
-              <w:t>fragile</w:t>
+              <w:t>leverage</w:t>
             </w:r>
           </w:p>
         </w:tc>
@@ -4297,77 +4297,77 @@
                 <w:rFonts w:ascii="Arial" w:hAnsi="Arial"/>
                 <w:sz w:val="18"/>
               </w:rPr>
-              <w:t>+21.733</w:t>
-            </w:r>
-          </w:p>
-        </w:tc>
-        <w:tc>
-          <w:tcPr>
-            <w:tcW w:type="dxa" w:w="864"/>
-          </w:tcPr>
-          <w:p>
-            <w:r>
-              <w:rPr>
-                <w:rFonts w:ascii="Arial" w:hAnsi="Arial"/>
-                <w:sz w:val="18"/>
-              </w:rPr>
-              <w:t>16.548</w:t>
-            </w:r>
-          </w:p>
-        </w:tc>
-        <w:tc>
-          <w:tcPr>
-            <w:tcW w:type="dxa" w:w="864"/>
-          </w:tcPr>
-          <w:p>
-            <w:r>
-              <w:rPr>
-                <w:rFonts w:ascii="Arial" w:hAnsi="Arial"/>
-                <w:sz w:val="18"/>
-              </w:rPr>
-              <w:t>0.189</w:t>
-            </w:r>
-          </w:p>
-        </w:tc>
-        <w:tc>
-          <w:tcPr>
-            <w:tcW w:type="dxa" w:w="864"/>
-          </w:tcPr>
-          <w:p>
-            <w:r>
-              <w:rPr>
-                <w:rFonts w:ascii="Arial" w:hAnsi="Arial"/>
-                <w:sz w:val="18"/>
-              </w:rPr>
-              <w:t>-10.701</w:t>
-            </w:r>
-          </w:p>
-        </w:tc>
-        <w:tc>
-          <w:tcPr>
-            <w:tcW w:type="dxa" w:w="864"/>
-          </w:tcPr>
-          <w:p>
-            <w:r>
-              <w:rPr>
-                <w:rFonts w:ascii="Arial" w:hAnsi="Arial"/>
-                <w:sz w:val="18"/>
-              </w:rPr>
-              <w:t>54.167</w:t>
-            </w:r>
-          </w:p>
-        </w:tc>
-        <w:tc>
-          <w:tcPr>
-            <w:tcW w:type="dxa" w:w="864"/>
-          </w:tcPr>
-          <w:p>
-            <w:r>
-              <w:rPr>
-                <w:rFonts w:ascii="Arial" w:hAnsi="Arial"/>
-                <w:sz w:val="18"/>
-              </w:rPr>
-              <w:t>42.200</w:t>
+              <w:t>+21.672</w:t>
+            </w:r>
+          </w:p>
+        </w:tc>
+        <w:tc>
+          <w:tcPr>
+            <w:tcW w:type="dxa" w:w="864"/>
+          </w:tcPr>
+          <w:p>
+            <w:r>
+              <w:rPr>
+                <w:rFonts w:ascii="Arial" w:hAnsi="Arial"/>
+                <w:sz w:val="18"/>
+              </w:rPr>
+              <w:t>16.557</w:t>
+            </w:r>
+          </w:p>
+        </w:tc>
+        <w:tc>
+          <w:tcPr>
+            <w:tcW w:type="dxa" w:w="864"/>
+          </w:tcPr>
+          <w:p>
+            <w:r>
+              <w:rPr>
+                <w:rFonts w:ascii="Arial" w:hAnsi="Arial"/>
+                <w:sz w:val="18"/>
+              </w:rPr>
+              <w:t>0.191</w:t>
+            </w:r>
+          </w:p>
+        </w:tc>
+        <w:tc>
+          <w:tcPr>
+            <w:tcW w:type="dxa" w:w="864"/>
+          </w:tcPr>
+          <w:p>
+            <w:r>
+              <w:rPr>
+                <w:rFonts w:ascii="Arial" w:hAnsi="Arial"/>
+                <w:sz w:val="18"/>
+              </w:rPr>
+              <w:t>-10.779</w:t>
+            </w:r>
+          </w:p>
+        </w:tc>
+        <w:tc>
+          <w:tcPr>
+            <w:tcW w:type="dxa" w:w="864"/>
+          </w:tcPr>
+          <w:p>
+            <w:r>
+              <w:rPr>
+                <w:rFonts w:ascii="Arial" w:hAnsi="Arial"/>
+                <w:sz w:val="18"/>
+              </w:rPr>
+              <w:t>54.123</w:t>
+            </w:r>
+          </w:p>
+        </w:tc>
+        <w:tc>
+          <w:tcPr>
+            <w:tcW w:type="dxa" w:w="864"/>
+          </w:tcPr>
+          <w:p>
+            <w:r>
+              <w:rPr>
+                <w:rFonts w:ascii="Arial" w:hAnsi="Arial"/>
+                <w:sz w:val="18"/>
+              </w:rPr>
+              <w:t>42.400</w:t>
             </w:r>
           </w:p>
         </w:tc>
@@ -4439,77 +4439,77 @@
                 <w:rFonts w:ascii="Arial" w:hAnsi="Arial"/>
                 <w:sz w:val="18"/>
               </w:rPr>
-              <w:t>+10.256</w:t>
-            </w:r>
-          </w:p>
-        </w:tc>
-        <w:tc>
-          <w:tcPr>
-            <w:tcW w:type="dxa" w:w="864"/>
-          </w:tcPr>
-          <w:p>
-            <w:r>
-              <w:rPr>
-                <w:rFonts w:ascii="Arial" w:hAnsi="Arial"/>
-                <w:sz w:val="18"/>
-              </w:rPr>
-              <w:t>20.342</w:t>
-            </w:r>
-          </w:p>
-        </w:tc>
-        <w:tc>
-          <w:tcPr>
-            <w:tcW w:type="dxa" w:w="864"/>
-          </w:tcPr>
-          <w:p>
-            <w:r>
-              <w:rPr>
-                <w:rFonts w:ascii="Arial" w:hAnsi="Arial"/>
-                <w:sz w:val="18"/>
-              </w:rPr>
-              <w:t>0.614</w:t>
-            </w:r>
-          </w:p>
-        </w:tc>
-        <w:tc>
-          <w:tcPr>
-            <w:tcW w:type="dxa" w:w="864"/>
-          </w:tcPr>
-          <w:p>
-            <w:r>
-              <w:rPr>
-                <w:rFonts w:ascii="Arial" w:hAnsi="Arial"/>
-                <w:sz w:val="18"/>
-              </w:rPr>
-              <w:t>-29.613</w:t>
-            </w:r>
-          </w:p>
-        </w:tc>
-        <w:tc>
-          <w:tcPr>
-            <w:tcW w:type="dxa" w:w="864"/>
-          </w:tcPr>
-          <w:p>
-            <w:r>
-              <w:rPr>
-                <w:rFonts w:ascii="Arial" w:hAnsi="Arial"/>
-                <w:sz w:val="18"/>
-              </w:rPr>
-              <w:t>50.124</w:t>
-            </w:r>
-          </w:p>
-        </w:tc>
-        <w:tc>
-          <w:tcPr>
-            <w:tcW w:type="dxa" w:w="864"/>
-          </w:tcPr>
-          <w:p>
-            <w:r>
-              <w:rPr>
-                <w:rFonts w:ascii="Arial" w:hAnsi="Arial"/>
-                <w:sz w:val="18"/>
-              </w:rPr>
-              <w:t>-32.900</w:t>
+              <w:t>+10.166</w:t>
+            </w:r>
+          </w:p>
+        </w:tc>
+        <w:tc>
+          <w:tcPr>
+            <w:tcW w:type="dxa" w:w="864"/>
+          </w:tcPr>
+          <w:p>
+            <w:r>
+              <w:rPr>
+                <w:rFonts w:ascii="Arial" w:hAnsi="Arial"/>
+                <w:sz w:val="18"/>
+              </w:rPr>
+              <w:t>20.343</w:t>
+            </w:r>
+          </w:p>
+        </w:tc>
+        <w:tc>
+          <w:tcPr>
+            <w:tcW w:type="dxa" w:w="864"/>
+          </w:tcPr>
+          <w:p>
+            <w:r>
+              <w:rPr>
+                <w:rFonts w:ascii="Arial" w:hAnsi="Arial"/>
+                <w:sz w:val="18"/>
+              </w:rPr>
+              <w:t>0.617</w:t>
+            </w:r>
+          </w:p>
+        </w:tc>
+        <w:tc>
+          <w:tcPr>
+            <w:tcW w:type="dxa" w:w="864"/>
+          </w:tcPr>
+          <w:p>
+            <w:r>
+              <w:rPr>
+                <w:rFonts w:ascii="Arial" w:hAnsi="Arial"/>
+                <w:sz w:val="18"/>
+              </w:rPr>
+              <w:t>-29.706</w:t>
+            </w:r>
+          </w:p>
+        </w:tc>
+        <w:tc>
+          <w:tcPr>
+            <w:tcW w:type="dxa" w:w="864"/>
+          </w:tcPr>
+          <w:p>
+            <w:r>
+              <w:rPr>
+                <w:rFonts w:ascii="Arial" w:hAnsi="Arial"/>
+                <w:sz w:val="18"/>
+              </w:rPr>
+              <w:t>50.037</w:t>
+            </w:r>
+          </w:p>
+        </w:tc>
+        <w:tc>
+          <w:tcPr>
+            <w:tcW w:type="dxa" w:w="864"/>
+          </w:tcPr>
+          <w:p>
+            <w:r>
+              <w:rPr>
+                <w:rFonts w:ascii="Arial" w:hAnsi="Arial"/>
+                <w:sz w:val="18"/>
+              </w:rPr>
+              <w:t>-33.200</w:t>
             </w:r>
           </w:p>
         </w:tc>
@@ -4581,77 +4581,77 @@
                 <w:rFonts w:ascii="Arial" w:hAnsi="Arial"/>
                 <w:sz w:val="18"/>
               </w:rPr>
-              <w:t>+3.656</w:t>
-            </w:r>
-          </w:p>
-        </w:tc>
-        <w:tc>
-          <w:tcPr>
-            <w:tcW w:type="dxa" w:w="864"/>
-          </w:tcPr>
-          <w:p>
-            <w:r>
-              <w:rPr>
-                <w:rFonts w:ascii="Arial" w:hAnsi="Arial"/>
-                <w:sz w:val="18"/>
-              </w:rPr>
-              <w:t>14.092</w:t>
-            </w:r>
-          </w:p>
-        </w:tc>
-        <w:tc>
-          <w:tcPr>
-            <w:tcW w:type="dxa" w:w="864"/>
-          </w:tcPr>
-          <w:p>
-            <w:r>
-              <w:rPr>
-                <w:rFonts w:ascii="Arial" w:hAnsi="Arial"/>
-                <w:sz w:val="18"/>
-              </w:rPr>
-              <w:t>0.795</w:t>
-            </w:r>
-          </w:p>
-        </w:tc>
-        <w:tc>
-          <w:tcPr>
-            <w:tcW w:type="dxa" w:w="864"/>
-          </w:tcPr>
-          <w:p>
-            <w:r>
-              <w:rPr>
-                <w:rFonts w:ascii="Arial" w:hAnsi="Arial"/>
-                <w:sz w:val="18"/>
-              </w:rPr>
-              <w:t>-23.964</w:t>
-            </w:r>
-          </w:p>
-        </w:tc>
-        <w:tc>
-          <w:tcPr>
-            <w:tcW w:type="dxa" w:w="864"/>
-          </w:tcPr>
-          <w:p>
-            <w:r>
-              <w:rPr>
-                <w:rFonts w:ascii="Arial" w:hAnsi="Arial"/>
-                <w:sz w:val="18"/>
-              </w:rPr>
-              <w:t>31.275</w:t>
-            </w:r>
-          </w:p>
-        </w:tc>
-        <w:tc>
-          <w:tcPr>
-            <w:tcW w:type="dxa" w:w="864"/>
-          </w:tcPr>
-          <w:p>
-            <w:r>
-              <w:rPr>
-                <w:rFonts w:ascii="Arial" w:hAnsi="Arial"/>
-                <w:sz w:val="18"/>
-              </w:rPr>
-              <w:t>-76.100</w:t>
+              <w:t>+3.592</w:t>
+            </w:r>
+          </w:p>
+        </w:tc>
+        <w:tc>
+          <w:tcPr>
+            <w:tcW w:type="dxa" w:w="864"/>
+          </w:tcPr>
+          <w:p>
+            <w:r>
+              <w:rPr>
+                <w:rFonts w:ascii="Arial" w:hAnsi="Arial"/>
+                <w:sz w:val="18"/>
+              </w:rPr>
+              <w:t>14.120</w:t>
+            </w:r>
+          </w:p>
+        </w:tc>
+        <w:tc>
+          <w:tcPr>
+            <w:tcW w:type="dxa" w:w="864"/>
+          </w:tcPr>
+          <w:p>
+            <w:r>
+              <w:rPr>
+                <w:rFonts w:ascii="Arial" w:hAnsi="Arial"/>
+                <w:sz w:val="18"/>
+              </w:rPr>
+              <w:t>0.799</w:t>
+            </w:r>
+          </w:p>
+        </w:tc>
+        <w:tc>
+          <w:tcPr>
+            <w:tcW w:type="dxa" w:w="864"/>
+          </w:tcPr>
+          <w:p>
+            <w:r>
+              <w:rPr>
+                <w:rFonts w:ascii="Arial" w:hAnsi="Arial"/>
+                <w:sz w:val="18"/>
+              </w:rPr>
+              <w:t>-24.082</w:t>
+            </w:r>
+          </w:p>
+        </w:tc>
+        <w:tc>
+          <w:tcPr>
+            <w:tcW w:type="dxa" w:w="864"/>
+          </w:tcPr>
+          <w:p>
+            <w:r>
+              <w:rPr>
+                <w:rFonts w:ascii="Arial" w:hAnsi="Arial"/>
+                <w:sz w:val="18"/>
+              </w:rPr>
+              <w:t>31.267</w:t>
+            </w:r>
+          </w:p>
+        </w:tc>
+        <w:tc>
+          <w:tcPr>
+            <w:tcW w:type="dxa" w:w="864"/>
+          </w:tcPr>
+          <w:p>
+            <w:r>
+              <w:rPr>
+                <w:rFonts w:ascii="Arial" w:hAnsi="Arial"/>
+                <w:sz w:val="18"/>
+              </w:rPr>
+              <w:t>-76.400</w:t>
             </w:r>
           </w:p>
         </w:tc>
@@ -4723,77 +4723,77 @@
                 <w:rFonts w:ascii="Arial" w:hAnsi="Arial"/>
                 <w:sz w:val="18"/>
               </w:rPr>
-              <w:t>+10.567</w:t>
-            </w:r>
-          </w:p>
-        </w:tc>
-        <w:tc>
-          <w:tcPr>
-            <w:tcW w:type="dxa" w:w="864"/>
-          </w:tcPr>
-          <w:p>
-            <w:r>
-              <w:rPr>
-                <w:rFonts w:ascii="Arial" w:hAnsi="Arial"/>
-                <w:sz w:val="18"/>
-              </w:rPr>
-              <w:t>17.860</w:t>
-            </w:r>
-          </w:p>
-        </w:tc>
-        <w:tc>
-          <w:tcPr>
-            <w:tcW w:type="dxa" w:w="864"/>
-          </w:tcPr>
-          <w:p>
-            <w:r>
-              <w:rPr>
-                <w:rFonts w:ascii="Arial" w:hAnsi="Arial"/>
-                <w:sz w:val="18"/>
-              </w:rPr>
-              <w:t>0.554</w:t>
-            </w:r>
-          </w:p>
-        </w:tc>
-        <w:tc>
-          <w:tcPr>
-            <w:tcW w:type="dxa" w:w="864"/>
-          </w:tcPr>
-          <w:p>
-            <w:r>
-              <w:rPr>
-                <w:rFonts w:ascii="Arial" w:hAnsi="Arial"/>
-                <w:sz w:val="18"/>
-              </w:rPr>
-              <w:t>-24.439</w:t>
-            </w:r>
-          </w:p>
-        </w:tc>
-        <w:tc>
-          <w:tcPr>
-            <w:tcW w:type="dxa" w:w="864"/>
-          </w:tcPr>
-          <w:p>
-            <w:r>
-              <w:rPr>
-                <w:rFonts w:ascii="Arial" w:hAnsi="Arial"/>
-                <w:sz w:val="18"/>
-              </w:rPr>
-              <w:t>45.572</w:t>
-            </w:r>
-          </w:p>
-        </w:tc>
-        <w:tc>
-          <w:tcPr>
-            <w:tcW w:type="dxa" w:w="864"/>
-          </w:tcPr>
-          <w:p>
-            <w:r>
-              <w:rPr>
-                <w:rFonts w:ascii="Arial" w:hAnsi="Arial"/>
-                <w:sz w:val="18"/>
-              </w:rPr>
-              <w:t>-30.900</w:t>
+              <w:t>+10.475</w:t>
+            </w:r>
+          </w:p>
+        </w:tc>
+        <w:tc>
+          <w:tcPr>
+            <w:tcW w:type="dxa" w:w="864"/>
+          </w:tcPr>
+          <w:p>
+            <w:r>
+              <w:rPr>
+                <w:rFonts w:ascii="Arial" w:hAnsi="Arial"/>
+                <w:sz w:val="18"/>
+              </w:rPr>
+              <w:t>17.864</w:t>
+            </w:r>
+          </w:p>
+        </w:tc>
+        <w:tc>
+          <w:tcPr>
+            <w:tcW w:type="dxa" w:w="864"/>
+          </w:tcPr>
+          <w:p>
+            <w:r>
+              <w:rPr>
+                <w:rFonts w:ascii="Arial" w:hAnsi="Arial"/>
+                <w:sz w:val="18"/>
+              </w:rPr>
+              <w:t>0.558</w:t>
+            </w:r>
+          </w:p>
+        </w:tc>
+        <w:tc>
+          <w:tcPr>
+            <w:tcW w:type="dxa" w:w="864"/>
+          </w:tcPr>
+          <w:p>
+            <w:r>
+              <w:rPr>
+                <w:rFonts w:ascii="Arial" w:hAnsi="Arial"/>
+                <w:sz w:val="18"/>
+              </w:rPr>
+              <w:t>-24.538</w:t>
+            </w:r>
+          </w:p>
+        </w:tc>
+        <w:tc>
+          <w:tcPr>
+            <w:tcW w:type="dxa" w:w="864"/>
+          </w:tcPr>
+          <w:p>
+            <w:r>
+              <w:rPr>
+                <w:rFonts w:ascii="Arial" w:hAnsi="Arial"/>
+                <w:sz w:val="18"/>
+              </w:rPr>
+              <w:t>45.489</w:t>
+            </w:r>
+          </w:p>
+        </w:tc>
+        <w:tc>
+          <w:tcPr>
+            <w:tcW w:type="dxa" w:w="864"/>
+          </w:tcPr>
+          <w:p>
+            <w:r>
+              <w:rPr>
+                <w:rFonts w:ascii="Arial" w:hAnsi="Arial"/>
+                <w:sz w:val="18"/>
+              </w:rPr>
+              <w:t>-31.200</w:t>
             </w:r>
           </w:p>
         </w:tc>
@@ -4865,63 +4865,63 @@
                 <w:rFonts w:ascii="Arial" w:hAnsi="Arial"/>
                 <w:sz w:val="18"/>
               </w:rPr>
-              <w:t>+13.567</w:t>
-            </w:r>
-          </w:p>
-        </w:tc>
-        <w:tc>
-          <w:tcPr>
-            <w:tcW w:type="dxa" w:w="864"/>
-          </w:tcPr>
-          <w:p>
-            <w:r>
-              <w:rPr>
-                <w:rFonts w:ascii="Arial" w:hAnsi="Arial"/>
-                <w:sz w:val="18"/>
-              </w:rPr>
-              <w:t>19.089</w:t>
-            </w:r>
-          </w:p>
-        </w:tc>
-        <w:tc>
-          <w:tcPr>
-            <w:tcW w:type="dxa" w:w="864"/>
-          </w:tcPr>
-          <w:p>
-            <w:r>
-              <w:rPr>
-                <w:rFonts w:ascii="Arial" w:hAnsi="Arial"/>
-                <w:sz w:val="18"/>
-              </w:rPr>
-              <w:t>0.477</w:t>
-            </w:r>
-          </w:p>
-        </w:tc>
-        <w:tc>
-          <w:tcPr>
-            <w:tcW w:type="dxa" w:w="864"/>
-          </w:tcPr>
-          <w:p>
-            <w:r>
-              <w:rPr>
-                <w:rFonts w:ascii="Arial" w:hAnsi="Arial"/>
-                <w:sz w:val="18"/>
-              </w:rPr>
-              <w:t>-23.846</w:t>
-            </w:r>
-          </w:p>
-        </w:tc>
-        <w:tc>
-          <w:tcPr>
-            <w:tcW w:type="dxa" w:w="864"/>
-          </w:tcPr>
-          <w:p>
-            <w:r>
-              <w:rPr>
-                <w:rFonts w:ascii="Arial" w:hAnsi="Arial"/>
-                <w:sz w:val="18"/>
-              </w:rPr>
-              <w:t>50.980</w:t>
+              <w:t>+13.505</w:t>
+            </w:r>
+          </w:p>
+        </w:tc>
+        <w:tc>
+          <w:tcPr>
+            <w:tcW w:type="dxa" w:w="864"/>
+          </w:tcPr>
+          <w:p>
+            <w:r>
+              <w:rPr>
+                <w:rFonts w:ascii="Arial" w:hAnsi="Arial"/>
+                <w:sz w:val="18"/>
+              </w:rPr>
+              <w:t>19.106</w:t>
+            </w:r>
+          </w:p>
+        </w:tc>
+        <w:tc>
+          <w:tcPr>
+            <w:tcW w:type="dxa" w:w="864"/>
+          </w:tcPr>
+          <w:p>
+            <w:r>
+              <w:rPr>
+                <w:rFonts w:ascii="Arial" w:hAnsi="Arial"/>
+                <w:sz w:val="18"/>
+              </w:rPr>
+              <w:t>0.480</w:t>
+            </w:r>
+          </w:p>
+        </w:tc>
+        <w:tc>
+          <w:tcPr>
+            <w:tcW w:type="dxa" w:w="864"/>
+          </w:tcPr>
+          <w:p>
+            <w:r>
+              <w:rPr>
+                <w:rFonts w:ascii="Arial" w:hAnsi="Arial"/>
+                <w:sz w:val="18"/>
+              </w:rPr>
+              <w:t>-23.942</w:t>
+            </w:r>
+          </w:p>
+        </w:tc>
+        <w:tc>
+          <w:tcPr>
+            <w:tcW w:type="dxa" w:w="864"/>
+          </w:tcPr>
+          <w:p>
+            <w:r>
+              <w:rPr>
+                <w:rFonts w:ascii="Arial" w:hAnsi="Arial"/>
+                <w:sz w:val="18"/>
+              </w:rPr>
+              <w:t>50.953</w:t>
             </w:r>
           </w:p>
         </w:tc>
@@ -5007,77 +5007,77 @@
                 <w:rFonts w:ascii="Arial" w:hAnsi="Arial"/>
                 <w:sz w:val="18"/>
               </w:rPr>
-              <w:t>+17.906</w:t>
-            </w:r>
-          </w:p>
-        </w:tc>
-        <w:tc>
-          <w:tcPr>
-            <w:tcW w:type="dxa" w:w="864"/>
-          </w:tcPr>
-          <w:p>
-            <w:r>
-              <w:rPr>
-                <w:rFonts w:ascii="Arial" w:hAnsi="Arial"/>
-                <w:sz w:val="18"/>
-              </w:rPr>
-              <w:t>21.212</w:t>
-            </w:r>
-          </w:p>
-        </w:tc>
-        <w:tc>
-          <w:tcPr>
-            <w:tcW w:type="dxa" w:w="864"/>
-          </w:tcPr>
-          <w:p>
-            <w:r>
-              <w:rPr>
-                <w:rFonts w:ascii="Arial" w:hAnsi="Arial"/>
-                <w:sz w:val="18"/>
-              </w:rPr>
-              <w:t>0.399</w:t>
-            </w:r>
-          </w:p>
-        </w:tc>
-        <w:tc>
-          <w:tcPr>
-            <w:tcW w:type="dxa" w:w="864"/>
-          </w:tcPr>
-          <w:p>
-            <w:r>
-              <w:rPr>
-                <w:rFonts w:ascii="Arial" w:hAnsi="Arial"/>
-                <w:sz w:val="18"/>
-              </w:rPr>
-              <w:t>-23.669</w:t>
-            </w:r>
-          </w:p>
-        </w:tc>
-        <w:tc>
-          <w:tcPr>
-            <w:tcW w:type="dxa" w:w="864"/>
-          </w:tcPr>
-          <w:p>
-            <w:r>
-              <w:rPr>
-                <w:rFonts w:ascii="Arial" w:hAnsi="Arial"/>
-                <w:sz w:val="18"/>
-              </w:rPr>
-              <w:t>59.480</w:t>
-            </w:r>
-          </w:p>
-        </w:tc>
-        <w:tc>
-          <w:tcPr>
-            <w:tcW w:type="dxa" w:w="864"/>
-          </w:tcPr>
-          <w:p>
-            <w:r>
-              <w:rPr>
-                <w:rFonts w:ascii="Arial" w:hAnsi="Arial"/>
-                <w:sz w:val="18"/>
-              </w:rPr>
-              <w:t>17.100</w:t>
+              <w:t>+17.836</w:t>
+            </w:r>
+          </w:p>
+        </w:tc>
+        <w:tc>
+          <w:tcPr>
+            <w:tcW w:type="dxa" w:w="864"/>
+          </w:tcPr>
+          <w:p>
+            <w:r>
+              <w:rPr>
+                <w:rFonts w:ascii="Arial" w:hAnsi="Arial"/>
+                <w:sz w:val="18"/>
+              </w:rPr>
+              <w:t>21.222</w:t>
+            </w:r>
+          </w:p>
+        </w:tc>
+        <w:tc>
+          <w:tcPr>
+            <w:tcW w:type="dxa" w:w="864"/>
+          </w:tcPr>
+          <w:p>
+            <w:r>
+              <w:rPr>
+                <w:rFonts w:ascii="Arial" w:hAnsi="Arial"/>
+                <w:sz w:val="18"/>
+              </w:rPr>
+              <w:t>0.401</w:t>
+            </w:r>
+          </w:p>
+        </w:tc>
+        <w:tc>
+          <w:tcPr>
+            <w:tcW w:type="dxa" w:w="864"/>
+          </w:tcPr>
+          <w:p>
+            <w:r>
+              <w:rPr>
+                <w:rFonts w:ascii="Arial" w:hAnsi="Arial"/>
+                <w:sz w:val="18"/>
+              </w:rPr>
+              <w:t>-23.758</w:t>
+            </w:r>
+          </w:p>
+        </w:tc>
+        <w:tc>
+          <w:tcPr>
+            <w:tcW w:type="dxa" w:w="864"/>
+          </w:tcPr>
+          <w:p>
+            <w:r>
+              <w:rPr>
+                <w:rFonts w:ascii="Arial" w:hAnsi="Arial"/>
+                <w:sz w:val="18"/>
+              </w:rPr>
+              <w:t>59.429</w:t>
+            </w:r>
+          </w:p>
+        </w:tc>
+        <w:tc>
+          <w:tcPr>
+            <w:tcW w:type="dxa" w:w="864"/>
+          </w:tcPr>
+          <w:p>
+            <w:r>
+              <w:rPr>
+                <w:rFonts w:ascii="Arial" w:hAnsi="Arial"/>
+                <w:sz w:val="18"/>
+              </w:rPr>
+              <w:t>17.200</w:t>
             </w:r>
           </w:p>
         </w:tc>
@@ -5149,77 +5149,77 @@
                 <w:rFonts w:ascii="Arial" w:hAnsi="Arial"/>
                 <w:sz w:val="18"/>
               </w:rPr>
-              <w:t>+22.039</w:t>
-            </w:r>
-          </w:p>
-        </w:tc>
-        <w:tc>
-          <w:tcPr>
-            <w:tcW w:type="dxa" w:w="864"/>
-          </w:tcPr>
-          <w:p>
-            <w:r>
-              <w:rPr>
-                <w:rFonts w:ascii="Arial" w:hAnsi="Arial"/>
-                <w:sz w:val="18"/>
-              </w:rPr>
-              <w:t>19.344</w:t>
-            </w:r>
-          </w:p>
-        </w:tc>
-        <w:tc>
-          <w:tcPr>
-            <w:tcW w:type="dxa" w:w="864"/>
-          </w:tcPr>
-          <w:p>
-            <w:r>
-              <w:rPr>
-                <w:rFonts w:ascii="Arial" w:hAnsi="Arial"/>
-                <w:sz w:val="18"/>
-              </w:rPr>
-              <w:t>0.255</w:t>
-            </w:r>
-          </w:p>
-        </w:tc>
-        <w:tc>
-          <w:tcPr>
-            <w:tcW w:type="dxa" w:w="864"/>
-          </w:tcPr>
-          <w:p>
-            <w:r>
-              <w:rPr>
-                <w:rFonts w:ascii="Arial" w:hAnsi="Arial"/>
-                <w:sz w:val="18"/>
-              </w:rPr>
-              <w:t>-15.875</w:t>
-            </w:r>
-          </w:p>
-        </w:tc>
-        <w:tc>
-          <w:tcPr>
-            <w:tcW w:type="dxa" w:w="864"/>
-          </w:tcPr>
-          <w:p>
-            <w:r>
-              <w:rPr>
-                <w:rFonts w:ascii="Arial" w:hAnsi="Arial"/>
-                <w:sz w:val="18"/>
-              </w:rPr>
-              <w:t>59.953</w:t>
-            </w:r>
-          </w:p>
-        </w:tc>
-        <w:tc>
-          <w:tcPr>
-            <w:tcW w:type="dxa" w:w="864"/>
-          </w:tcPr>
-          <w:p>
-            <w:r>
-              <w:rPr>
-                <w:rFonts w:ascii="Arial" w:hAnsi="Arial"/>
-                <w:sz w:val="18"/>
-              </w:rPr>
-              <w:t>44.100</w:t>
+              <w:t>+21.969</w:t>
+            </w:r>
+          </w:p>
+        </w:tc>
+        <w:tc>
+          <w:tcPr>
+            <w:tcW w:type="dxa" w:w="864"/>
+          </w:tcPr>
+          <w:p>
+            <w:r>
+              <w:rPr>
+                <w:rFonts w:ascii="Arial" w:hAnsi="Arial"/>
+                <w:sz w:val="18"/>
+              </w:rPr>
+              <w:t>19.354</w:t>
+            </w:r>
+          </w:p>
+        </w:tc>
+        <w:tc>
+          <w:tcPr>
+            <w:tcW w:type="dxa" w:w="864"/>
+          </w:tcPr>
+          <w:p>
+            <w:r>
+              <w:rPr>
+                <w:rFonts w:ascii="Arial" w:hAnsi="Arial"/>
+                <w:sz w:val="18"/>
+              </w:rPr>
+              <w:t>0.256</w:t>
+            </w:r>
+          </w:p>
+        </w:tc>
+        <w:tc>
+          <w:tcPr>
+            <w:tcW w:type="dxa" w:w="864"/>
+          </w:tcPr>
+          <w:p>
+            <w:r>
+              <w:rPr>
+                <w:rFonts w:ascii="Arial" w:hAnsi="Arial"/>
+                <w:sz w:val="18"/>
+              </w:rPr>
+              <w:t>-15.965</w:t>
+            </w:r>
+          </w:p>
+        </w:tc>
+        <w:tc>
+          <w:tcPr>
+            <w:tcW w:type="dxa" w:w="864"/>
+          </w:tcPr>
+          <w:p>
+            <w:r>
+              <w:rPr>
+                <w:rFonts w:ascii="Arial" w:hAnsi="Arial"/>
+                <w:sz w:val="18"/>
+              </w:rPr>
+              <w:t>59.903</w:t>
+            </w:r>
+          </w:p>
+        </w:tc>
+        <w:tc>
+          <w:tcPr>
+            <w:tcW w:type="dxa" w:w="864"/>
+          </w:tcPr>
+          <w:p>
+            <w:r>
+              <w:rPr>
+                <w:rFonts w:ascii="Arial" w:hAnsi="Arial"/>
+                <w:sz w:val="18"/>
+              </w:rPr>
+              <w:t>44.400</w:t>
             </w:r>
           </w:p>
         </w:tc>
@@ -5291,77 +5291,77 @@
                 <w:rFonts w:ascii="Arial" w:hAnsi="Arial"/>
                 <w:sz w:val="18"/>
               </w:rPr>
-              <w:t>+22.589</w:t>
-            </w:r>
-          </w:p>
-        </w:tc>
-        <w:tc>
-          <w:tcPr>
-            <w:tcW w:type="dxa" w:w="864"/>
-          </w:tcPr>
-          <w:p>
-            <w:r>
-              <w:rPr>
-                <w:rFonts w:ascii="Arial" w:hAnsi="Arial"/>
-                <w:sz w:val="18"/>
-              </w:rPr>
-              <w:t>18.950</w:t>
-            </w:r>
-          </w:p>
-        </w:tc>
-        <w:tc>
-          <w:tcPr>
-            <w:tcW w:type="dxa" w:w="864"/>
-          </w:tcPr>
-          <w:p>
-            <w:r>
-              <w:rPr>
-                <w:rFonts w:ascii="Arial" w:hAnsi="Arial"/>
-                <w:sz w:val="18"/>
-              </w:rPr>
-              <w:t>0.233</w:t>
-            </w:r>
-          </w:p>
-        </w:tc>
-        <w:tc>
-          <w:tcPr>
-            <w:tcW w:type="dxa" w:w="864"/>
-          </w:tcPr>
-          <w:p>
-            <w:r>
-              <w:rPr>
-                <w:rFonts w:ascii="Arial" w:hAnsi="Arial"/>
-                <w:sz w:val="18"/>
-              </w:rPr>
-              <w:t>-14.552</w:t>
-            </w:r>
-          </w:p>
-        </w:tc>
-        <w:tc>
-          <w:tcPr>
-            <w:tcW w:type="dxa" w:w="864"/>
-          </w:tcPr>
-          <w:p>
-            <w:r>
-              <w:rPr>
-                <w:rFonts w:ascii="Arial" w:hAnsi="Arial"/>
-                <w:sz w:val="18"/>
-              </w:rPr>
-              <w:t>59.729</w:t>
-            </w:r>
-          </w:p>
-        </w:tc>
-        <w:tc>
-          <w:tcPr>
-            <w:tcW w:type="dxa" w:w="864"/>
-          </w:tcPr>
-          <w:p>
-            <w:r>
-              <w:rPr>
-                <w:rFonts w:ascii="Arial" w:hAnsi="Arial"/>
-                <w:sz w:val="18"/>
-              </w:rPr>
-              <w:t>47.700</w:t>
+              <w:t>+22.526</w:t>
+            </w:r>
+          </w:p>
+        </w:tc>
+        <w:tc>
+          <w:tcPr>
+            <w:tcW w:type="dxa" w:w="864"/>
+          </w:tcPr>
+          <w:p>
+            <w:r>
+              <w:rPr>
+                <w:rFonts w:ascii="Arial" w:hAnsi="Arial"/>
+                <w:sz w:val="18"/>
+              </w:rPr>
+              <w:t>18.955</w:t>
+            </w:r>
+          </w:p>
+        </w:tc>
+        <w:tc>
+          <w:tcPr>
+            <w:tcW w:type="dxa" w:w="864"/>
+          </w:tcPr>
+          <w:p>
+            <w:r>
+              <w:rPr>
+                <w:rFonts w:ascii="Arial" w:hAnsi="Arial"/>
+                <w:sz w:val="18"/>
+              </w:rPr>
+              <w:t>0.235</w:t>
+            </w:r>
+          </w:p>
+        </w:tc>
+        <w:tc>
+          <w:tcPr>
+            <w:tcW w:type="dxa" w:w="864"/>
+          </w:tcPr>
+          <w:p>
+            <w:r>
+              <w:rPr>
+                <w:rFonts w:ascii="Arial" w:hAnsi="Arial"/>
+                <w:sz w:val="18"/>
+              </w:rPr>
+              <w:t>-14.625</w:t>
+            </w:r>
+          </w:p>
+        </w:tc>
+        <w:tc>
+          <w:tcPr>
+            <w:tcW w:type="dxa" w:w="864"/>
+          </w:tcPr>
+          <w:p>
+            <w:r>
+              <w:rPr>
+                <w:rFonts w:ascii="Arial" w:hAnsi="Arial"/>
+                <w:sz w:val="18"/>
+              </w:rPr>
+              <w:t>59.676</w:t>
+            </w:r>
+          </w:p>
+        </w:tc>
+        <w:tc>
+          <w:tcPr>
+            <w:tcW w:type="dxa" w:w="864"/>
+          </w:tcPr>
+          <w:p>
+            <w:r>
+              <w:rPr>
+                <w:rFonts w:ascii="Arial" w:hAnsi="Arial"/>
+                <w:sz w:val="18"/>
+              </w:rPr>
+              <w:t>48.000</w:t>
             </w:r>
           </w:p>
         </w:tc>
@@ -5433,77 +5433,77 @@
                 <w:rFonts w:ascii="Arial" w:hAnsi="Arial"/>
                 <w:sz w:val="18"/>
               </w:rPr>
-              <w:t>-2.587</w:t>
-            </w:r>
-          </w:p>
-        </w:tc>
-        <w:tc>
-          <w:tcPr>
-            <w:tcW w:type="dxa" w:w="864"/>
-          </w:tcPr>
-          <w:p>
-            <w:r>
-              <w:rPr>
-                <w:rFonts w:ascii="Arial" w:hAnsi="Arial"/>
-                <w:sz w:val="18"/>
-              </w:rPr>
-              <w:t>3.396</w:t>
-            </w:r>
-          </w:p>
-        </w:tc>
-        <w:tc>
-          <w:tcPr>
-            <w:tcW w:type="dxa" w:w="864"/>
-          </w:tcPr>
-          <w:p>
-            <w:r>
-              <w:rPr>
-                <w:rFonts w:ascii="Arial" w:hAnsi="Arial"/>
-                <w:sz w:val="18"/>
-              </w:rPr>
-              <w:t>0.446</w:t>
-            </w:r>
-          </w:p>
-        </w:tc>
-        <w:tc>
-          <w:tcPr>
-            <w:tcW w:type="dxa" w:w="864"/>
-          </w:tcPr>
-          <w:p>
-            <w:r>
-              <w:rPr>
-                <w:rFonts w:ascii="Arial" w:hAnsi="Arial"/>
-                <w:sz w:val="18"/>
-              </w:rPr>
-              <w:t>-9.243</w:t>
-            </w:r>
-          </w:p>
-        </w:tc>
-        <w:tc>
-          <w:tcPr>
-            <w:tcW w:type="dxa" w:w="864"/>
-          </w:tcPr>
-          <w:p>
-            <w:r>
-              <w:rPr>
-                <w:rFonts w:ascii="Arial" w:hAnsi="Arial"/>
-                <w:sz w:val="18"/>
-              </w:rPr>
-              <w:t>4.070</w:t>
-            </w:r>
-          </w:p>
-        </w:tc>
-        <w:tc>
-          <w:tcPr>
-            <w:tcW w:type="dxa" w:w="864"/>
-          </w:tcPr>
-          <w:p>
-            <w:r>
-              <w:rPr>
-                <w:rFonts w:ascii="Arial" w:hAnsi="Arial"/>
-                <w:sz w:val="18"/>
-              </w:rPr>
-              <w:t>27.900</w:t>
+              <w:t>-2.618</w:t>
+            </w:r>
+          </w:p>
+        </w:tc>
+        <w:tc>
+          <w:tcPr>
+            <w:tcW w:type="dxa" w:w="864"/>
+          </w:tcPr>
+          <w:p>
+            <w:r>
+              <w:rPr>
+                <w:rFonts w:ascii="Arial" w:hAnsi="Arial"/>
+                <w:sz w:val="18"/>
+              </w:rPr>
+              <w:t>3.408</w:t>
+            </w:r>
+          </w:p>
+        </w:tc>
+        <w:tc>
+          <w:tcPr>
+            <w:tcW w:type="dxa" w:w="864"/>
+          </w:tcPr>
+          <w:p>
+            <w:r>
+              <w:rPr>
+                <w:rFonts w:ascii="Arial" w:hAnsi="Arial"/>
+                <w:sz w:val="18"/>
+              </w:rPr>
+              <w:t>0.442</w:t>
+            </w:r>
+          </w:p>
+        </w:tc>
+        <w:tc>
+          <w:tcPr>
+            <w:tcW w:type="dxa" w:w="864"/>
+          </w:tcPr>
+          <w:p>
+            <w:r>
+              <w:rPr>
+                <w:rFonts w:ascii="Arial" w:hAnsi="Arial"/>
+                <w:sz w:val="18"/>
+              </w:rPr>
+              <w:t>-9.298</w:t>
+            </w:r>
+          </w:p>
+        </w:tc>
+        <w:tc>
+          <w:tcPr>
+            <w:tcW w:type="dxa" w:w="864"/>
+          </w:tcPr>
+          <w:p>
+            <w:r>
+              <w:rPr>
+                <w:rFonts w:ascii="Arial" w:hAnsi="Arial"/>
+                <w:sz w:val="18"/>
+              </w:rPr>
+              <w:t>4.062</w:t>
+            </w:r>
+          </w:p>
+        </w:tc>
+        <w:tc>
+          <w:tcPr>
+            <w:tcW w:type="dxa" w:w="864"/>
+          </w:tcPr>
+          <w:p>
+            <w:r>
+              <w:rPr>
+                <w:rFonts w:ascii="Arial" w:hAnsi="Arial"/>
+                <w:sz w:val="18"/>
+              </w:rPr>
+              <w:t>27.700</w:t>
             </w:r>
           </w:p>
         </w:tc>
@@ -5575,77 +5575,77 @@
                 <w:rFonts w:ascii="Arial" w:hAnsi="Arial"/>
                 <w:sz w:val="18"/>
               </w:rPr>
-              <w:t>-3.483</w:t>
-            </w:r>
-          </w:p>
-        </w:tc>
-        <w:tc>
-          <w:tcPr>
-            <w:tcW w:type="dxa" w:w="864"/>
-          </w:tcPr>
-          <w:p>
-            <w:r>
-              <w:rPr>
-                <w:rFonts w:ascii="Arial" w:hAnsi="Arial"/>
-                <w:sz w:val="18"/>
-              </w:rPr>
-              <w:t>3.342</w:t>
-            </w:r>
-          </w:p>
-        </w:tc>
-        <w:tc>
-          <w:tcPr>
-            <w:tcW w:type="dxa" w:w="864"/>
-          </w:tcPr>
-          <w:p>
-            <w:r>
-              <w:rPr>
-                <w:rFonts w:ascii="Arial" w:hAnsi="Arial"/>
-                <w:sz w:val="18"/>
-              </w:rPr>
-              <w:t>0.297</w:t>
-            </w:r>
-          </w:p>
-        </w:tc>
-        <w:tc>
-          <w:tcPr>
-            <w:tcW w:type="dxa" w:w="864"/>
-          </w:tcPr>
-          <w:p>
-            <w:r>
-              <w:rPr>
-                <w:rFonts w:ascii="Arial" w:hAnsi="Arial"/>
-                <w:sz w:val="18"/>
-              </w:rPr>
-              <w:t>-10.034</w:t>
-            </w:r>
-          </w:p>
-        </w:tc>
-        <w:tc>
-          <w:tcPr>
-            <w:tcW w:type="dxa" w:w="864"/>
-          </w:tcPr>
-          <w:p>
-            <w:r>
-              <w:rPr>
-                <w:rFonts w:ascii="Arial" w:hAnsi="Arial"/>
-                <w:sz w:val="18"/>
-              </w:rPr>
-              <w:t>3.068</w:t>
-            </w:r>
-          </w:p>
-        </w:tc>
-        <w:tc>
-          <w:tcPr>
-            <w:tcW w:type="dxa" w:w="864"/>
-          </w:tcPr>
-          <w:p>
-            <w:r>
-              <w:rPr>
-                <w:rFonts w:ascii="Arial" w:hAnsi="Arial"/>
-                <w:sz w:val="18"/>
-              </w:rPr>
-              <w:t>2.900</w:t>
+              <w:t>-3.529</w:t>
+            </w:r>
+          </w:p>
+        </w:tc>
+        <w:tc>
+          <w:tcPr>
+            <w:tcW w:type="dxa" w:w="864"/>
+          </w:tcPr>
+          <w:p>
+            <w:r>
+              <w:rPr>
+                <w:rFonts w:ascii="Arial" w:hAnsi="Arial"/>
+                <w:sz w:val="18"/>
+              </w:rPr>
+              <w:t>3.352</w:t>
+            </w:r>
+          </w:p>
+        </w:tc>
+        <w:tc>
+          <w:tcPr>
+            <w:tcW w:type="dxa" w:w="864"/>
+          </w:tcPr>
+          <w:p>
+            <w:r>
+              <w:rPr>
+                <w:rFonts w:ascii="Arial" w:hAnsi="Arial"/>
+                <w:sz w:val="18"/>
+              </w:rPr>
+              <w:t>0.292</w:t>
+            </w:r>
+          </w:p>
+        </w:tc>
+        <w:tc>
+          <w:tcPr>
+            <w:tcW w:type="dxa" w:w="864"/>
+          </w:tcPr>
+          <w:p>
+            <w:r>
+              <w:rPr>
+                <w:rFonts w:ascii="Arial" w:hAnsi="Arial"/>
+                <w:sz w:val="18"/>
+              </w:rPr>
+              <w:t>-10.099</w:t>
+            </w:r>
+          </w:p>
+        </w:tc>
+        <w:tc>
+          <w:tcPr>
+            <w:tcW w:type="dxa" w:w="864"/>
+          </w:tcPr>
+          <w:p>
+            <w:r>
+              <w:rPr>
+                <w:rFonts w:ascii="Arial" w:hAnsi="Arial"/>
+                <w:sz w:val="18"/>
+              </w:rPr>
+              <w:t>3.040</w:t>
+            </w:r>
+          </w:p>
+        </w:tc>
+        <w:tc>
+          <w:tcPr>
+            <w:tcW w:type="dxa" w:w="864"/>
+          </w:tcPr>
+          <w:p>
+            <w:r>
+              <w:rPr>
+                <w:rFonts w:ascii="Arial" w:hAnsi="Arial"/>
+                <w:sz w:val="18"/>
+              </w:rPr>
+              <w:t>2.600</w:t>
             </w:r>
           </w:p>
         </w:tc>
@@ -5717,77 +5717,77 @@
                 <w:rFonts w:ascii="Arial" w:hAnsi="Arial"/>
                 <w:sz w:val="18"/>
               </w:rPr>
-              <w:t>-1.933</w:t>
-            </w:r>
-          </w:p>
-        </w:tc>
-        <w:tc>
-          <w:tcPr>
-            <w:tcW w:type="dxa" w:w="864"/>
-          </w:tcPr>
-          <w:p>
-            <w:r>
-              <w:rPr>
-                <w:rFonts w:ascii="Arial" w:hAnsi="Arial"/>
-                <w:sz w:val="18"/>
-              </w:rPr>
-              <w:t>2.418</w:t>
-            </w:r>
-          </w:p>
-        </w:tc>
-        <w:tc>
-          <w:tcPr>
-            <w:tcW w:type="dxa" w:w="864"/>
-          </w:tcPr>
-          <w:p>
-            <w:r>
-              <w:rPr>
-                <w:rFonts w:ascii="Arial" w:hAnsi="Arial"/>
-                <w:sz w:val="18"/>
-              </w:rPr>
-              <w:t>0.424</w:t>
-            </w:r>
-          </w:p>
-        </w:tc>
-        <w:tc>
-          <w:tcPr>
-            <w:tcW w:type="dxa" w:w="864"/>
-          </w:tcPr>
-          <w:p>
-            <w:r>
-              <w:rPr>
-                <w:rFonts w:ascii="Arial" w:hAnsi="Arial"/>
-                <w:sz w:val="18"/>
-              </w:rPr>
-              <w:t>-6.672</w:t>
-            </w:r>
-          </w:p>
-        </w:tc>
-        <w:tc>
-          <w:tcPr>
-            <w:tcW w:type="dxa" w:w="864"/>
-          </w:tcPr>
-          <w:p>
-            <w:r>
-              <w:rPr>
-                <w:rFonts w:ascii="Arial" w:hAnsi="Arial"/>
-                <w:sz w:val="18"/>
-              </w:rPr>
-              <w:t>2.805</w:t>
-            </w:r>
-          </w:p>
-        </w:tc>
-        <w:tc>
-          <w:tcPr>
-            <w:tcW w:type="dxa" w:w="864"/>
-          </w:tcPr>
-          <w:p>
-            <w:r>
-              <w:rPr>
-                <w:rFonts w:ascii="Arial" w:hAnsi="Arial"/>
-                <w:sz w:val="18"/>
-              </w:rPr>
-              <w:t>46.100</w:t>
+              <w:t>-1.966</w:t>
+            </w:r>
+          </w:p>
+        </w:tc>
+        <w:tc>
+          <w:tcPr>
+            <w:tcW w:type="dxa" w:w="864"/>
+          </w:tcPr>
+          <w:p>
+            <w:r>
+              <w:rPr>
+                <w:rFonts w:ascii="Arial" w:hAnsi="Arial"/>
+                <w:sz w:val="18"/>
+              </w:rPr>
+              <w:t>2.424</w:t>
+            </w:r>
+          </w:p>
+        </w:tc>
+        <w:tc>
+          <w:tcPr>
+            <w:tcW w:type="dxa" w:w="864"/>
+          </w:tcPr>
+          <w:p>
+            <w:r>
+              <w:rPr>
+                <w:rFonts w:ascii="Arial" w:hAnsi="Arial"/>
+                <w:sz w:val="18"/>
+              </w:rPr>
+              <w:t>0.417</w:t>
+            </w:r>
+          </w:p>
+        </w:tc>
+        <w:tc>
+          <w:tcPr>
+            <w:tcW w:type="dxa" w:w="864"/>
+          </w:tcPr>
+          <w:p>
+            <w:r>
+              <w:rPr>
+                <w:rFonts w:ascii="Arial" w:hAnsi="Arial"/>
+                <w:sz w:val="18"/>
+              </w:rPr>
+              <w:t>-6.717</w:t>
+            </w:r>
+          </w:p>
+        </w:tc>
+        <w:tc>
+          <w:tcPr>
+            <w:tcW w:type="dxa" w:w="864"/>
+          </w:tcPr>
+          <w:p>
+            <w:r>
+              <w:rPr>
+                <w:rFonts w:ascii="Arial" w:hAnsi="Arial"/>
+                <w:sz w:val="18"/>
+              </w:rPr>
+              <w:t>2.786</w:t>
+            </w:r>
+          </w:p>
+        </w:tc>
+        <w:tc>
+          <w:tcPr>
+            <w:tcW w:type="dxa" w:w="864"/>
+          </w:tcPr>
+          <w:p>
+            <w:r>
+              <w:rPr>
+                <w:rFonts w:ascii="Arial" w:hAnsi="Arial"/>
+                <w:sz w:val="18"/>
+              </w:rPr>
+              <w:t>45.700</w:t>
             </w:r>
           </w:p>
         </w:tc>
@@ -5859,21 +5859,21 @@
                 <w:rFonts w:ascii="Arial" w:hAnsi="Arial"/>
                 <w:sz w:val="18"/>
               </w:rPr>
-              <w:t>-5.587</w:t>
-            </w:r>
-          </w:p>
-        </w:tc>
-        <w:tc>
-          <w:tcPr>
-            <w:tcW w:type="dxa" w:w="864"/>
-          </w:tcPr>
-          <w:p>
-            <w:r>
-              <w:rPr>
-                <w:rFonts w:ascii="Arial" w:hAnsi="Arial"/>
-                <w:sz w:val="18"/>
-              </w:rPr>
-              <w:t>2.119</w:t>
+              <w:t>-5.633</w:t>
+            </w:r>
+          </w:p>
+        </w:tc>
+        <w:tc>
+          <w:tcPr>
+            <w:tcW w:type="dxa" w:w="864"/>
+          </w:tcPr>
+          <w:p>
+            <w:r>
+              <w:rPr>
+                <w:rFonts w:ascii="Arial" w:hAnsi="Arial"/>
+                <w:sz w:val="18"/>
+              </w:rPr>
+              <w:t>2.122</w:t>
             </w:r>
           </w:p>
         </w:tc>
@@ -5901,35 +5901,35 @@
                 <w:rFonts w:ascii="Arial" w:hAnsi="Arial"/>
                 <w:sz w:val="18"/>
               </w:rPr>
-              <w:t>-9.741</w:t>
-            </w:r>
-          </w:p>
-        </w:tc>
-        <w:tc>
-          <w:tcPr>
-            <w:tcW w:type="dxa" w:w="864"/>
-          </w:tcPr>
-          <w:p>
-            <w:r>
-              <w:rPr>
-                <w:rFonts w:ascii="Arial" w:hAnsi="Arial"/>
-                <w:sz w:val="18"/>
-              </w:rPr>
-              <w:t>-1.433</w:t>
-            </w:r>
-          </w:p>
-        </w:tc>
-        <w:tc>
-          <w:tcPr>
-            <w:tcW w:type="dxa" w:w="864"/>
-          </w:tcPr>
-          <w:p>
-            <w:r>
-              <w:rPr>
-                <w:rFonts w:ascii="Arial" w:hAnsi="Arial"/>
-                <w:sz w:val="18"/>
-              </w:rPr>
-              <w:t>-55.800</w:t>
+              <w:t>-9.793</w:t>
+            </w:r>
+          </w:p>
+        </w:tc>
+        <w:tc>
+          <w:tcPr>
+            <w:tcW w:type="dxa" w:w="864"/>
+          </w:tcPr>
+          <w:p>
+            <w:r>
+              <w:rPr>
+                <w:rFonts w:ascii="Arial" w:hAnsi="Arial"/>
+                <w:sz w:val="18"/>
+              </w:rPr>
+              <w:t>-1.474</w:t>
+            </w:r>
+          </w:p>
+        </w:tc>
+        <w:tc>
+          <w:tcPr>
+            <w:tcW w:type="dxa" w:w="864"/>
+          </w:tcPr>
+          <w:p>
+            <w:r>
+              <w:rPr>
+                <w:rFonts w:ascii="Arial" w:hAnsi="Arial"/>
+                <w:sz w:val="18"/>
+              </w:rPr>
+              <w:t>-55.500</w:t>
             </w:r>
           </w:p>
         </w:tc>
@@ -6001,77 +6001,77 @@
                 <w:rFonts w:ascii="Arial" w:hAnsi="Arial"/>
                 <w:sz w:val="18"/>
               </w:rPr>
-              <w:t>-2.587</w:t>
-            </w:r>
-          </w:p>
-        </w:tc>
-        <w:tc>
-          <w:tcPr>
-            <w:tcW w:type="dxa" w:w="864"/>
-          </w:tcPr>
-          <w:p>
-            <w:r>
-              <w:rPr>
-                <w:rFonts w:ascii="Arial" w:hAnsi="Arial"/>
-                <w:sz w:val="18"/>
-              </w:rPr>
-              <w:t>3.396</w:t>
-            </w:r>
-          </w:p>
-        </w:tc>
-        <w:tc>
-          <w:tcPr>
-            <w:tcW w:type="dxa" w:w="864"/>
-          </w:tcPr>
-          <w:p>
-            <w:r>
-              <w:rPr>
-                <w:rFonts w:ascii="Arial" w:hAnsi="Arial"/>
-                <w:sz w:val="18"/>
-              </w:rPr>
-              <w:t>0.446</w:t>
-            </w:r>
-          </w:p>
-        </w:tc>
-        <w:tc>
-          <w:tcPr>
-            <w:tcW w:type="dxa" w:w="864"/>
-          </w:tcPr>
-          <w:p>
-            <w:r>
-              <w:rPr>
-                <w:rFonts w:ascii="Arial" w:hAnsi="Arial"/>
-                <w:sz w:val="18"/>
-              </w:rPr>
-              <w:t>-9.243</w:t>
-            </w:r>
-          </w:p>
-        </w:tc>
-        <w:tc>
-          <w:tcPr>
-            <w:tcW w:type="dxa" w:w="864"/>
-          </w:tcPr>
-          <w:p>
-            <w:r>
-              <w:rPr>
-                <w:rFonts w:ascii="Arial" w:hAnsi="Arial"/>
-                <w:sz w:val="18"/>
-              </w:rPr>
-              <w:t>4.070</w:t>
-            </w:r>
-          </w:p>
-        </w:tc>
-        <w:tc>
-          <w:tcPr>
-            <w:tcW w:type="dxa" w:w="864"/>
-          </w:tcPr>
-          <w:p>
-            <w:r>
-              <w:rPr>
-                <w:rFonts w:ascii="Arial" w:hAnsi="Arial"/>
-                <w:sz w:val="18"/>
-              </w:rPr>
-              <w:t>27.900</w:t>
+              <w:t>-2.618</w:t>
+            </w:r>
+          </w:p>
+        </w:tc>
+        <w:tc>
+          <w:tcPr>
+            <w:tcW w:type="dxa" w:w="864"/>
+          </w:tcPr>
+          <w:p>
+            <w:r>
+              <w:rPr>
+                <w:rFonts w:ascii="Arial" w:hAnsi="Arial"/>
+                <w:sz w:val="18"/>
+              </w:rPr>
+              <w:t>3.408</w:t>
+            </w:r>
+          </w:p>
+        </w:tc>
+        <w:tc>
+          <w:tcPr>
+            <w:tcW w:type="dxa" w:w="864"/>
+          </w:tcPr>
+          <w:p>
+            <w:r>
+              <w:rPr>
+                <w:rFonts w:ascii="Arial" w:hAnsi="Arial"/>
+                <w:sz w:val="18"/>
+              </w:rPr>
+              <w:t>0.442</w:t>
+            </w:r>
+          </w:p>
+        </w:tc>
+        <w:tc>
+          <w:tcPr>
+            <w:tcW w:type="dxa" w:w="864"/>
+          </w:tcPr>
+          <w:p>
+            <w:r>
+              <w:rPr>
+                <w:rFonts w:ascii="Arial" w:hAnsi="Arial"/>
+                <w:sz w:val="18"/>
+              </w:rPr>
+              <w:t>-9.298</w:t>
+            </w:r>
+          </w:p>
+        </w:tc>
+        <w:tc>
+          <w:tcPr>
+            <w:tcW w:type="dxa" w:w="864"/>
+          </w:tcPr>
+          <w:p>
+            <w:r>
+              <w:rPr>
+                <w:rFonts w:ascii="Arial" w:hAnsi="Arial"/>
+                <w:sz w:val="18"/>
+              </w:rPr>
+              <w:t>4.062</w:t>
+            </w:r>
+          </w:p>
+        </w:tc>
+        <w:tc>
+          <w:tcPr>
+            <w:tcW w:type="dxa" w:w="864"/>
+          </w:tcPr>
+          <w:p>
+            <w:r>
+              <w:rPr>
+                <w:rFonts w:ascii="Arial" w:hAnsi="Arial"/>
+                <w:sz w:val="18"/>
+              </w:rPr>
+              <w:t>27.700</w:t>
             </w:r>
           </w:p>
         </w:tc>
@@ -6143,77 +6143,77 @@
                 <w:rFonts w:ascii="Arial" w:hAnsi="Arial"/>
                 <w:sz w:val="18"/>
               </w:rPr>
-              <w:t>-4.517</w:t>
-            </w:r>
-          </w:p>
-        </w:tc>
-        <w:tc>
-          <w:tcPr>
-            <w:tcW w:type="dxa" w:w="864"/>
-          </w:tcPr>
-          <w:p>
-            <w:r>
-              <w:rPr>
-                <w:rFonts w:ascii="Arial" w:hAnsi="Arial"/>
-                <w:sz w:val="18"/>
-              </w:rPr>
-              <w:t>3.082</w:t>
-            </w:r>
-          </w:p>
-        </w:tc>
-        <w:tc>
-          <w:tcPr>
-            <w:tcW w:type="dxa" w:w="864"/>
-          </w:tcPr>
-          <w:p>
-            <w:r>
-              <w:rPr>
-                <w:rFonts w:ascii="Arial" w:hAnsi="Arial"/>
-                <w:sz w:val="18"/>
-              </w:rPr>
-              <w:t>0.143</w:t>
-            </w:r>
-          </w:p>
-        </w:tc>
-        <w:tc>
-          <w:tcPr>
-            <w:tcW w:type="dxa" w:w="864"/>
-          </w:tcPr>
-          <w:p>
-            <w:r>
-              <w:rPr>
-                <w:rFonts w:ascii="Arial" w:hAnsi="Arial"/>
-                <w:sz w:val="18"/>
-              </w:rPr>
-              <w:t>-10.558</w:t>
-            </w:r>
-          </w:p>
-        </w:tc>
-        <w:tc>
-          <w:tcPr>
-            <w:tcW w:type="dxa" w:w="864"/>
-          </w:tcPr>
-          <w:p>
-            <w:r>
-              <w:rPr>
-                <w:rFonts w:ascii="Arial" w:hAnsi="Arial"/>
-                <w:sz w:val="18"/>
-              </w:rPr>
-              <w:t>1.524</w:t>
-            </w:r>
-          </w:p>
-        </w:tc>
-        <w:tc>
-          <w:tcPr>
-            <w:tcW w:type="dxa" w:w="864"/>
-          </w:tcPr>
-          <w:p>
-            <w:r>
-              <w:rPr>
-                <w:rFonts w:ascii="Arial" w:hAnsi="Arial"/>
-                <w:sz w:val="18"/>
-              </w:rPr>
-              <w:t>-25.900</w:t>
+              <w:t>-4.553</w:t>
+            </w:r>
+          </w:p>
+        </w:tc>
+        <w:tc>
+          <w:tcPr>
+            <w:tcW w:type="dxa" w:w="864"/>
+          </w:tcPr>
+          <w:p>
+            <w:r>
+              <w:rPr>
+                <w:rFonts w:ascii="Arial" w:hAnsi="Arial"/>
+                <w:sz w:val="18"/>
+              </w:rPr>
+              <w:t>3.092</w:t>
+            </w:r>
+          </w:p>
+        </w:tc>
+        <w:tc>
+          <w:tcPr>
+            <w:tcW w:type="dxa" w:w="864"/>
+          </w:tcPr>
+          <w:p>
+            <w:r>
+              <w:rPr>
+                <w:rFonts w:ascii="Arial" w:hAnsi="Arial"/>
+                <w:sz w:val="18"/>
+              </w:rPr>
+              <w:t>0.141</w:t>
+            </w:r>
+          </w:p>
+        </w:tc>
+        <w:tc>
+          <w:tcPr>
+            <w:tcW w:type="dxa" w:w="864"/>
+          </w:tcPr>
+          <w:p>
+            <w:r>
+              <w:rPr>
+                <w:rFonts w:ascii="Arial" w:hAnsi="Arial"/>
+                <w:sz w:val="18"/>
+              </w:rPr>
+              <w:t>-10.613</w:t>
+            </w:r>
+          </w:p>
+        </w:tc>
+        <w:tc>
+          <w:tcPr>
+            <w:tcW w:type="dxa" w:w="864"/>
+          </w:tcPr>
+          <w:p>
+            <w:r>
+              <w:rPr>
+                <w:rFonts w:ascii="Arial" w:hAnsi="Arial"/>
+                <w:sz w:val="18"/>
+              </w:rPr>
+              <w:t>1.508</w:t>
+            </w:r>
+          </w:p>
+        </w:tc>
+        <w:tc>
+          <w:tcPr>
+            <w:tcW w:type="dxa" w:w="864"/>
+          </w:tcPr>
+          <w:p>
+            <w:r>
+              <w:rPr>
+                <w:rFonts w:ascii="Arial" w:hAnsi="Arial"/>
+                <w:sz w:val="18"/>
+              </w:rPr>
+              <w:t>-25.600</w:t>
             </w:r>
           </w:p>
         </w:tc>
@@ -6285,77 +6285,77 @@
                 <w:rFonts w:ascii="Arial" w:hAnsi="Arial"/>
                 <w:sz w:val="18"/>
               </w:rPr>
-              <w:t>-4.517</w:t>
-            </w:r>
-          </w:p>
-        </w:tc>
-        <w:tc>
-          <w:tcPr>
-            <w:tcW w:type="dxa" w:w="864"/>
-          </w:tcPr>
-          <w:p>
-            <w:r>
-              <w:rPr>
-                <w:rFonts w:ascii="Arial" w:hAnsi="Arial"/>
-                <w:sz w:val="18"/>
-              </w:rPr>
-              <w:t>3.082</w:t>
-            </w:r>
-          </w:p>
-        </w:tc>
-        <w:tc>
-          <w:tcPr>
-            <w:tcW w:type="dxa" w:w="864"/>
-          </w:tcPr>
-          <w:p>
-            <w:r>
-              <w:rPr>
-                <w:rFonts w:ascii="Arial" w:hAnsi="Arial"/>
-                <w:sz w:val="18"/>
-              </w:rPr>
-              <w:t>0.143</w:t>
-            </w:r>
-          </w:p>
-        </w:tc>
-        <w:tc>
-          <w:tcPr>
-            <w:tcW w:type="dxa" w:w="864"/>
-          </w:tcPr>
-          <w:p>
-            <w:r>
-              <w:rPr>
-                <w:rFonts w:ascii="Arial" w:hAnsi="Arial"/>
-                <w:sz w:val="18"/>
-              </w:rPr>
-              <w:t>-10.558</w:t>
-            </w:r>
-          </w:p>
-        </w:tc>
-        <w:tc>
-          <w:tcPr>
-            <w:tcW w:type="dxa" w:w="864"/>
-          </w:tcPr>
-          <w:p>
-            <w:r>
-              <w:rPr>
-                <w:rFonts w:ascii="Arial" w:hAnsi="Arial"/>
-                <w:sz w:val="18"/>
-              </w:rPr>
-              <w:t>1.524</w:t>
-            </w:r>
-          </w:p>
-        </w:tc>
-        <w:tc>
-          <w:tcPr>
-            <w:tcW w:type="dxa" w:w="864"/>
-          </w:tcPr>
-          <w:p>
-            <w:r>
-              <w:rPr>
-                <w:rFonts w:ascii="Arial" w:hAnsi="Arial"/>
-                <w:sz w:val="18"/>
-              </w:rPr>
-              <w:t>-25.900</w:t>
+              <w:t>-4.553</w:t>
+            </w:r>
+          </w:p>
+        </w:tc>
+        <w:tc>
+          <w:tcPr>
+            <w:tcW w:type="dxa" w:w="864"/>
+          </w:tcPr>
+          <w:p>
+            <w:r>
+              <w:rPr>
+                <w:rFonts w:ascii="Arial" w:hAnsi="Arial"/>
+                <w:sz w:val="18"/>
+              </w:rPr>
+              <w:t>3.092</w:t>
+            </w:r>
+          </w:p>
+        </w:tc>
+        <w:tc>
+          <w:tcPr>
+            <w:tcW w:type="dxa" w:w="864"/>
+          </w:tcPr>
+          <w:p>
+            <w:r>
+              <w:rPr>
+                <w:rFonts w:ascii="Arial" w:hAnsi="Arial"/>
+                <w:sz w:val="18"/>
+              </w:rPr>
+              <w:t>0.141</w:t>
+            </w:r>
+          </w:p>
+        </w:tc>
+        <w:tc>
+          <w:tcPr>
+            <w:tcW w:type="dxa" w:w="864"/>
+          </w:tcPr>
+          <w:p>
+            <w:r>
+              <w:rPr>
+                <w:rFonts w:ascii="Arial" w:hAnsi="Arial"/>
+                <w:sz w:val="18"/>
+              </w:rPr>
+              <w:t>-10.613</w:t>
+            </w:r>
+          </w:p>
+        </w:tc>
+        <w:tc>
+          <w:tcPr>
+            <w:tcW w:type="dxa" w:w="864"/>
+          </w:tcPr>
+          <w:p>
+            <w:r>
+              <w:rPr>
+                <w:rFonts w:ascii="Arial" w:hAnsi="Arial"/>
+                <w:sz w:val="18"/>
+              </w:rPr>
+              <w:t>1.507</w:t>
+            </w:r>
+          </w:p>
+        </w:tc>
+        <w:tc>
+          <w:tcPr>
+            <w:tcW w:type="dxa" w:w="864"/>
+          </w:tcPr>
+          <w:p>
+            <w:r>
+              <w:rPr>
+                <w:rFonts w:ascii="Arial" w:hAnsi="Arial"/>
+                <w:sz w:val="18"/>
+              </w:rPr>
+              <w:t>-25.700</w:t>
             </w:r>
           </w:p>
         </w:tc>
@@ -6427,77 +6427,77 @@
                 <w:rFonts w:ascii="Arial" w:hAnsi="Arial"/>
                 <w:sz w:val="18"/>
               </w:rPr>
-              <w:t>-3.483</w:t>
-            </w:r>
-          </w:p>
-        </w:tc>
-        <w:tc>
-          <w:tcPr>
-            <w:tcW w:type="dxa" w:w="864"/>
-          </w:tcPr>
-          <w:p>
-            <w:r>
-              <w:rPr>
-                <w:rFonts w:ascii="Arial" w:hAnsi="Arial"/>
-                <w:sz w:val="18"/>
-              </w:rPr>
-              <w:t>3.342</w:t>
-            </w:r>
-          </w:p>
-        </w:tc>
-        <w:tc>
-          <w:tcPr>
-            <w:tcW w:type="dxa" w:w="864"/>
-          </w:tcPr>
-          <w:p>
-            <w:r>
-              <w:rPr>
-                <w:rFonts w:ascii="Arial" w:hAnsi="Arial"/>
-                <w:sz w:val="18"/>
-              </w:rPr>
-              <w:t>0.297</w:t>
-            </w:r>
-          </w:p>
-        </w:tc>
-        <w:tc>
-          <w:tcPr>
-            <w:tcW w:type="dxa" w:w="864"/>
-          </w:tcPr>
-          <w:p>
-            <w:r>
-              <w:rPr>
-                <w:rFonts w:ascii="Arial" w:hAnsi="Arial"/>
-                <w:sz w:val="18"/>
-              </w:rPr>
-              <w:t>-10.034</w:t>
-            </w:r>
-          </w:p>
-        </w:tc>
-        <w:tc>
-          <w:tcPr>
-            <w:tcW w:type="dxa" w:w="864"/>
-          </w:tcPr>
-          <w:p>
-            <w:r>
-              <w:rPr>
-                <w:rFonts w:ascii="Arial" w:hAnsi="Arial"/>
-                <w:sz w:val="18"/>
-              </w:rPr>
-              <w:t>3.068</w:t>
-            </w:r>
-          </w:p>
-        </w:tc>
-        <w:tc>
-          <w:tcPr>
-            <w:tcW w:type="dxa" w:w="864"/>
-          </w:tcPr>
-          <w:p>
-            <w:r>
-              <w:rPr>
-                <w:rFonts w:ascii="Arial" w:hAnsi="Arial"/>
-                <w:sz w:val="18"/>
-              </w:rPr>
-              <w:t>2.900</w:t>
+              <w:t>-3.516</w:t>
+            </w:r>
+          </w:p>
+        </w:tc>
+        <w:tc>
+          <w:tcPr>
+            <w:tcW w:type="dxa" w:w="864"/>
+          </w:tcPr>
+          <w:p>
+            <w:r>
+              <w:rPr>
+                <w:rFonts w:ascii="Arial" w:hAnsi="Arial"/>
+                <w:sz w:val="18"/>
+              </w:rPr>
+              <w:t>3.351</w:t>
+            </w:r>
+          </w:p>
+        </w:tc>
+        <w:tc>
+          <w:tcPr>
+            <w:tcW w:type="dxa" w:w="864"/>
+          </w:tcPr>
+          <w:p>
+            <w:r>
+              <w:rPr>
+                <w:rFonts w:ascii="Arial" w:hAnsi="Arial"/>
+                <w:sz w:val="18"/>
+              </w:rPr>
+              <w:t>0.294</w:t>
+            </w:r>
+          </w:p>
+        </w:tc>
+        <w:tc>
+          <w:tcPr>
+            <w:tcW w:type="dxa" w:w="864"/>
+          </w:tcPr>
+          <w:p>
+            <w:r>
+              <w:rPr>
+                <w:rFonts w:ascii="Arial" w:hAnsi="Arial"/>
+                <w:sz w:val="18"/>
+              </w:rPr>
+              <w:t>-10.084</w:t>
+            </w:r>
+          </w:p>
+        </w:tc>
+        <w:tc>
+          <w:tcPr>
+            <w:tcW w:type="dxa" w:w="864"/>
+          </w:tcPr>
+          <w:p>
+            <w:r>
+              <w:rPr>
+                <w:rFonts w:ascii="Arial" w:hAnsi="Arial"/>
+                <w:sz w:val="18"/>
+              </w:rPr>
+              <w:t>3.052</w:t>
+            </w:r>
+          </w:p>
+        </w:tc>
+        <w:tc>
+          <w:tcPr>
+            <w:tcW w:type="dxa" w:w="864"/>
+          </w:tcPr>
+          <w:p>
+            <w:r>
+              <w:rPr>
+                <w:rFonts w:ascii="Arial" w:hAnsi="Arial"/>
+                <w:sz w:val="18"/>
+              </w:rPr>
+              <w:t>3.000</w:t>
             </w:r>
           </w:p>
         </w:tc>
@@ -6569,77 +6569,77 @@
                 <w:rFonts w:ascii="Arial" w:hAnsi="Arial"/>
                 <w:sz w:val="18"/>
               </w:rPr>
-              <w:t>-0.000</w:t>
-            </w:r>
-          </w:p>
-        </w:tc>
-        <w:tc>
-          <w:tcPr>
-            <w:tcW w:type="dxa" w:w="864"/>
-          </w:tcPr>
-          <w:p>
-            <w:r>
-              <w:rPr>
-                <w:rFonts w:ascii="Arial" w:hAnsi="Arial"/>
-                <w:sz w:val="18"/>
-              </w:rPr>
-              <w:t>0.000</w:t>
-            </w:r>
-          </w:p>
-        </w:tc>
-        <w:tc>
-          <w:tcPr>
-            <w:tcW w:type="dxa" w:w="864"/>
-          </w:tcPr>
-          <w:p>
-            <w:r>
-              <w:rPr>
-                <w:rFonts w:ascii="Arial" w:hAnsi="Arial"/>
-                <w:sz w:val="18"/>
-              </w:rPr>
-              <w:t>0.198</w:t>
-            </w:r>
-          </w:p>
-        </w:tc>
-        <w:tc>
-          <w:tcPr>
-            <w:tcW w:type="dxa" w:w="864"/>
-          </w:tcPr>
-          <w:p>
-            <w:r>
-              <w:rPr>
-                <w:rFonts w:ascii="Arial" w:hAnsi="Arial"/>
-                <w:sz w:val="18"/>
-              </w:rPr>
-              <w:t>-0.000</w:t>
-            </w:r>
-          </w:p>
-        </w:tc>
-        <w:tc>
-          <w:tcPr>
-            <w:tcW w:type="dxa" w:w="864"/>
-          </w:tcPr>
-          <w:p>
-            <w:r>
-              <w:rPr>
-                <w:rFonts w:ascii="Arial" w:hAnsi="Arial"/>
-                <w:sz w:val="18"/>
-              </w:rPr>
-              <w:t>0.000</w:t>
-            </w:r>
-          </w:p>
-        </w:tc>
-        <w:tc>
-          <w:tcPr>
-            <w:tcW w:type="dxa" w:w="864"/>
-          </w:tcPr>
-          <w:p>
-            <w:r>
-              <w:rPr>
-                <w:rFonts w:ascii="Arial" w:hAnsi="Arial"/>
-                <w:sz w:val="18"/>
-              </w:rPr>
-              <w:t>nan</w:t>
+              <w:t>-0.091</w:t>
+            </w:r>
+          </w:p>
+        </w:tc>
+        <w:tc>
+          <w:tcPr>
+            <w:tcW w:type="dxa" w:w="864"/>
+          </w:tcPr>
+          <w:p>
+            <w:r>
+              <w:rPr>
+                <w:rFonts w:ascii="Arial" w:hAnsi="Arial"/>
+                <w:sz w:val="18"/>
+              </w:rPr>
+              <w:t>0.075</w:t>
+            </w:r>
+          </w:p>
+        </w:tc>
+        <w:tc>
+          <w:tcPr>
+            <w:tcW w:type="dxa" w:w="864"/>
+          </w:tcPr>
+          <w:p>
+            <w:r>
+              <w:rPr>
+                <w:rFonts w:ascii="Arial" w:hAnsi="Arial"/>
+                <w:sz w:val="18"/>
+              </w:rPr>
+              <w:t>0.225</w:t>
+            </w:r>
+          </w:p>
+        </w:tc>
+        <w:tc>
+          <w:tcPr>
+            <w:tcW w:type="dxa" w:w="864"/>
+          </w:tcPr>
+          <w:p>
+            <w:r>
+              <w:rPr>
+                <w:rFonts w:ascii="Arial" w:hAnsi="Arial"/>
+                <w:sz w:val="18"/>
+              </w:rPr>
+              <w:t>-0.238</w:t>
+            </w:r>
+          </w:p>
+        </w:tc>
+        <w:tc>
+          <w:tcPr>
+            <w:tcW w:type="dxa" w:w="864"/>
+          </w:tcPr>
+          <w:p>
+            <w:r>
+              <w:rPr>
+                <w:rFonts w:ascii="Arial" w:hAnsi="Arial"/>
+                <w:sz w:val="18"/>
+              </w:rPr>
+              <w:t>0.056</w:t>
+            </w:r>
+          </w:p>
+        </w:tc>
+        <w:tc>
+          <w:tcPr>
+            <w:tcW w:type="dxa" w:w="864"/>
+          </w:tcPr>
+          <w:p>
+            <w:r>
+              <w:rPr>
+                <w:rFonts w:ascii="Arial" w:hAnsi="Arial"/>
+                <w:sz w:val="18"/>
+              </w:rPr>
+              <w:t>6.900</w:t>
             </w:r>
           </w:p>
         </w:tc>
@@ -6711,77 +6711,77 @@
                 <w:rFonts w:ascii="Arial" w:hAnsi="Arial"/>
                 <w:sz w:val="18"/>
               </w:rPr>
-              <w:t>-0.000</w:t>
-            </w:r>
-          </w:p>
-        </w:tc>
-        <w:tc>
-          <w:tcPr>
-            <w:tcW w:type="dxa" w:w="864"/>
-          </w:tcPr>
-          <w:p>
-            <w:r>
-              <w:rPr>
-                <w:rFonts w:ascii="Arial" w:hAnsi="Arial"/>
-                <w:sz w:val="18"/>
-              </w:rPr>
-              <w:t>0.000</w:t>
-            </w:r>
-          </w:p>
-        </w:tc>
-        <w:tc>
-          <w:tcPr>
-            <w:tcW w:type="dxa" w:w="864"/>
-          </w:tcPr>
-          <w:p>
-            <w:r>
-              <w:rPr>
-                <w:rFonts w:ascii="Arial" w:hAnsi="Arial"/>
-                <w:sz w:val="18"/>
-              </w:rPr>
-              <w:t>0.148</w:t>
-            </w:r>
-          </w:p>
-        </w:tc>
-        <w:tc>
-          <w:tcPr>
-            <w:tcW w:type="dxa" w:w="864"/>
-          </w:tcPr>
-          <w:p>
-            <w:r>
-              <w:rPr>
-                <w:rFonts w:ascii="Arial" w:hAnsi="Arial"/>
-                <w:sz w:val="18"/>
-              </w:rPr>
-              <w:t>-0.000</w:t>
-            </w:r>
-          </w:p>
-        </w:tc>
-        <w:tc>
-          <w:tcPr>
-            <w:tcW w:type="dxa" w:w="864"/>
-          </w:tcPr>
-          <w:p>
-            <w:r>
-              <w:rPr>
-                <w:rFonts w:ascii="Arial" w:hAnsi="Arial"/>
-                <w:sz w:val="18"/>
-              </w:rPr>
-              <w:t>0.000</w:t>
-            </w:r>
-          </w:p>
-        </w:tc>
-        <w:tc>
-          <w:tcPr>
-            <w:tcW w:type="dxa" w:w="864"/>
-          </w:tcPr>
-          <w:p>
-            <w:r>
-              <w:rPr>
-                <w:rFonts w:ascii="Arial" w:hAnsi="Arial"/>
-                <w:sz w:val="18"/>
-              </w:rPr>
-              <w:t>nan</w:t>
+              <w:t>-0.138</w:t>
+            </w:r>
+          </w:p>
+        </w:tc>
+        <w:tc>
+          <w:tcPr>
+            <w:tcW w:type="dxa" w:w="864"/>
+          </w:tcPr>
+          <w:p>
+            <w:r>
+              <w:rPr>
+                <w:rFonts w:ascii="Arial" w:hAnsi="Arial"/>
+                <w:sz w:val="18"/>
+              </w:rPr>
+              <w:t>0.050</w:t>
+            </w:r>
+          </w:p>
+        </w:tc>
+        <w:tc>
+          <w:tcPr>
+            <w:tcW w:type="dxa" w:w="864"/>
+          </w:tcPr>
+          <w:p>
+            <w:r>
+              <w:rPr>
+                <w:rFonts w:ascii="Arial" w:hAnsi="Arial"/>
+                <w:sz w:val="18"/>
+              </w:rPr>
+              <w:t>0.006</w:t>
+            </w:r>
+          </w:p>
+        </w:tc>
+        <w:tc>
+          <w:tcPr>
+            <w:tcW w:type="dxa" w:w="864"/>
+          </w:tcPr>
+          <w:p>
+            <w:r>
+              <w:rPr>
+                <w:rFonts w:ascii="Arial" w:hAnsi="Arial"/>
+                <w:sz w:val="18"/>
+              </w:rPr>
+              <w:t>-0.235</w:t>
+            </w:r>
+          </w:p>
+        </w:tc>
+        <w:tc>
+          <w:tcPr>
+            <w:tcW w:type="dxa" w:w="864"/>
+          </w:tcPr>
+          <w:p>
+            <w:r>
+              <w:rPr>
+                <w:rFonts w:ascii="Arial" w:hAnsi="Arial"/>
+                <w:sz w:val="18"/>
+              </w:rPr>
+              <w:t>-0.040</w:t>
+            </w:r>
+          </w:p>
+        </w:tc>
+        <w:tc>
+          <w:tcPr>
+            <w:tcW w:type="dxa" w:w="864"/>
+          </w:tcPr>
+          <w:p>
+            <w:r>
+              <w:rPr>
+                <w:rFonts w:ascii="Arial" w:hAnsi="Arial"/>
+                <w:sz w:val="18"/>
+              </w:rPr>
+              <w:t>-40.700</w:t>
             </w:r>
           </w:p>
         </w:tc>
@@ -6853,77 +6853,77 @@
                 <w:rFonts w:ascii="Arial" w:hAnsi="Arial"/>
                 <w:sz w:val="18"/>
               </w:rPr>
-              <w:t>-0.000</w:t>
-            </w:r>
-          </w:p>
-        </w:tc>
-        <w:tc>
-          <w:tcPr>
-            <w:tcW w:type="dxa" w:w="864"/>
-          </w:tcPr>
-          <w:p>
-            <w:r>
-              <w:rPr>
-                <w:rFonts w:ascii="Arial" w:hAnsi="Arial"/>
-                <w:sz w:val="18"/>
-              </w:rPr>
-              <w:t>0.000</w:t>
-            </w:r>
-          </w:p>
-        </w:tc>
-        <w:tc>
-          <w:tcPr>
-            <w:tcW w:type="dxa" w:w="864"/>
-          </w:tcPr>
-          <w:p>
-            <w:r>
-              <w:rPr>
-                <w:rFonts w:ascii="Arial" w:hAnsi="Arial"/>
-                <w:sz w:val="18"/>
-              </w:rPr>
-              <w:t>0.148</w:t>
-            </w:r>
-          </w:p>
-        </w:tc>
-        <w:tc>
-          <w:tcPr>
-            <w:tcW w:type="dxa" w:w="864"/>
-          </w:tcPr>
-          <w:p>
-            <w:r>
-              <w:rPr>
-                <w:rFonts w:ascii="Arial" w:hAnsi="Arial"/>
-                <w:sz w:val="18"/>
-              </w:rPr>
-              <w:t>-0.000</w:t>
-            </w:r>
-          </w:p>
-        </w:tc>
-        <w:tc>
-          <w:tcPr>
-            <w:tcW w:type="dxa" w:w="864"/>
-          </w:tcPr>
-          <w:p>
-            <w:r>
-              <w:rPr>
-                <w:rFonts w:ascii="Arial" w:hAnsi="Arial"/>
-                <w:sz w:val="18"/>
-              </w:rPr>
-              <w:t>0.000</w:t>
-            </w:r>
-          </w:p>
-        </w:tc>
-        <w:tc>
-          <w:tcPr>
-            <w:tcW w:type="dxa" w:w="864"/>
-          </w:tcPr>
-          <w:p>
-            <w:r>
-              <w:rPr>
-                <w:rFonts w:ascii="Arial" w:hAnsi="Arial"/>
-                <w:sz w:val="18"/>
-              </w:rPr>
-              <w:t>nan</w:t>
+              <w:t>-0.063</w:t>
+            </w:r>
+          </w:p>
+        </w:tc>
+        <w:tc>
+          <w:tcPr>
+            <w:tcW w:type="dxa" w:w="864"/>
+          </w:tcPr>
+          <w:p>
+            <w:r>
+              <w:rPr>
+                <w:rFonts w:ascii="Arial" w:hAnsi="Arial"/>
+                <w:sz w:val="18"/>
+              </w:rPr>
+              <w:t>0.062</w:t>
+            </w:r>
+          </w:p>
+        </w:tc>
+        <w:tc>
+          <w:tcPr>
+            <w:tcW w:type="dxa" w:w="864"/>
+          </w:tcPr>
+          <w:p>
+            <w:r>
+              <w:rPr>
+                <w:rFonts w:ascii="Arial" w:hAnsi="Arial"/>
+                <w:sz w:val="18"/>
+              </w:rPr>
+              <w:t>0.306</w:t>
+            </w:r>
+          </w:p>
+        </w:tc>
+        <w:tc>
+          <w:tcPr>
+            <w:tcW w:type="dxa" w:w="864"/>
+          </w:tcPr>
+          <w:p>
+            <w:r>
+              <w:rPr>
+                <w:rFonts w:ascii="Arial" w:hAnsi="Arial"/>
+                <w:sz w:val="18"/>
+              </w:rPr>
+              <w:t>-0.185</w:t>
+            </w:r>
+          </w:p>
+        </w:tc>
+        <w:tc>
+          <w:tcPr>
+            <w:tcW w:type="dxa" w:w="864"/>
+          </w:tcPr>
+          <w:p>
+            <w:r>
+              <w:rPr>
+                <w:rFonts w:ascii="Arial" w:hAnsi="Arial"/>
+                <w:sz w:val="18"/>
+              </w:rPr>
+              <w:t>0.058</w:t>
+            </w:r>
+          </w:p>
+        </w:tc>
+        <w:tc>
+          <w:tcPr>
+            <w:tcW w:type="dxa" w:w="864"/>
+          </w:tcPr>
+          <w:p>
+            <w:r>
+              <w:rPr>
+                <w:rFonts w:ascii="Arial" w:hAnsi="Arial"/>
+                <w:sz w:val="18"/>
+              </w:rPr>
+              <w:t>35.200</w:t>
             </w:r>
           </w:p>
         </w:tc>
@@ -6995,77 +6995,77 @@
                 <w:rFonts w:ascii="Arial" w:hAnsi="Arial"/>
                 <w:sz w:val="18"/>
               </w:rPr>
-              <w:t>+0.000</w:t>
-            </w:r>
-          </w:p>
-        </w:tc>
-        <w:tc>
-          <w:tcPr>
-            <w:tcW w:type="dxa" w:w="864"/>
-          </w:tcPr>
-          <w:p>
-            <w:r>
-              <w:rPr>
-                <w:rFonts w:ascii="Arial" w:hAnsi="Arial"/>
-                <w:sz w:val="18"/>
-              </w:rPr>
-              <w:t>0.000</w:t>
-            </w:r>
-          </w:p>
-        </w:tc>
-        <w:tc>
-          <w:tcPr>
-            <w:tcW w:type="dxa" w:w="864"/>
-          </w:tcPr>
-          <w:p>
-            <w:r>
-              <w:rPr>
-                <w:rFonts w:ascii="Arial" w:hAnsi="Arial"/>
-                <w:sz w:val="18"/>
-              </w:rPr>
-              <w:t>0.069</w:t>
-            </w:r>
-          </w:p>
-        </w:tc>
-        <w:tc>
-          <w:tcPr>
-            <w:tcW w:type="dxa" w:w="864"/>
-          </w:tcPr>
-          <w:p>
-            <w:r>
-              <w:rPr>
-                <w:rFonts w:ascii="Arial" w:hAnsi="Arial"/>
-                <w:sz w:val="18"/>
-              </w:rPr>
-              <w:t>-0.000</w:t>
-            </w:r>
-          </w:p>
-        </w:tc>
-        <w:tc>
-          <w:tcPr>
-            <w:tcW w:type="dxa" w:w="864"/>
-          </w:tcPr>
-          <w:p>
-            <w:r>
-              <w:rPr>
-                <w:rFonts w:ascii="Arial" w:hAnsi="Arial"/>
-                <w:sz w:val="18"/>
-              </w:rPr>
-              <w:t>0.000</w:t>
-            </w:r>
-          </w:p>
-        </w:tc>
-        <w:tc>
-          <w:tcPr>
-            <w:tcW w:type="dxa" w:w="864"/>
-          </w:tcPr>
-          <w:p>
-            <w:r>
-              <w:rPr>
-                <w:rFonts w:ascii="Arial" w:hAnsi="Arial"/>
-                <w:sz w:val="18"/>
-              </w:rPr>
-              <w:t>nan</w:t>
+              <w:t>-0.128</w:t>
+            </w:r>
+          </w:p>
+        </w:tc>
+        <w:tc>
+          <w:tcPr>
+            <w:tcW w:type="dxa" w:w="864"/>
+          </w:tcPr>
+          <w:p>
+            <w:r>
+              <w:rPr>
+                <w:rFonts w:ascii="Arial" w:hAnsi="Arial"/>
+                <w:sz w:val="18"/>
+              </w:rPr>
+              <w:t>0.056</w:t>
+            </w:r>
+          </w:p>
+        </w:tc>
+        <w:tc>
+          <w:tcPr>
+            <w:tcW w:type="dxa" w:w="864"/>
+          </w:tcPr>
+          <w:p>
+            <w:r>
+              <w:rPr>
+                <w:rFonts w:ascii="Arial" w:hAnsi="Arial"/>
+                <w:sz w:val="18"/>
+              </w:rPr>
+              <w:t>0.023</w:t>
+            </w:r>
+          </w:p>
+        </w:tc>
+        <w:tc>
+          <w:tcPr>
+            <w:tcW w:type="dxa" w:w="864"/>
+          </w:tcPr>
+          <w:p>
+            <w:r>
+              <w:rPr>
+                <w:rFonts w:ascii="Arial" w:hAnsi="Arial"/>
+                <w:sz w:val="18"/>
+              </w:rPr>
+              <w:t>-0.238</w:t>
+            </w:r>
+          </w:p>
+        </w:tc>
+        <w:tc>
+          <w:tcPr>
+            <w:tcW w:type="dxa" w:w="864"/>
+          </w:tcPr>
+          <w:p>
+            <w:r>
+              <w:rPr>
+                <w:rFonts w:ascii="Arial" w:hAnsi="Arial"/>
+                <w:sz w:val="18"/>
+              </w:rPr>
+              <w:t>-0.018</w:t>
+            </w:r>
+          </w:p>
+        </w:tc>
+        <w:tc>
+          <w:tcPr>
+            <w:tcW w:type="dxa" w:w="864"/>
+          </w:tcPr>
+          <w:p>
+            <w:r>
+              <w:rPr>
+                <w:rFonts w:ascii="Arial" w:hAnsi="Arial"/>
+                <w:sz w:val="18"/>
+              </w:rPr>
+              <w:t>-30.500</w:t>
             </w:r>
           </w:p>
         </w:tc>
@@ -7137,77 +7137,77 @@
                 <w:rFonts w:ascii="Arial" w:hAnsi="Arial"/>
                 <w:sz w:val="18"/>
               </w:rPr>
-              <w:t>-0.000</w:t>
-            </w:r>
-          </w:p>
-        </w:tc>
-        <w:tc>
-          <w:tcPr>
-            <w:tcW w:type="dxa" w:w="864"/>
-          </w:tcPr>
-          <w:p>
-            <w:r>
-              <w:rPr>
-                <w:rFonts w:ascii="Arial" w:hAnsi="Arial"/>
-                <w:sz w:val="18"/>
-              </w:rPr>
-              <w:t>0.000</w:t>
-            </w:r>
-          </w:p>
-        </w:tc>
-        <w:tc>
-          <w:tcPr>
-            <w:tcW w:type="dxa" w:w="864"/>
-          </w:tcPr>
-          <w:p>
-            <w:r>
-              <w:rPr>
-                <w:rFonts w:ascii="Arial" w:hAnsi="Arial"/>
-                <w:sz w:val="18"/>
-              </w:rPr>
-              <w:t>0.822</w:t>
-            </w:r>
-          </w:p>
-        </w:tc>
-        <w:tc>
-          <w:tcPr>
-            <w:tcW w:type="dxa" w:w="864"/>
-          </w:tcPr>
-          <w:p>
-            <w:r>
-              <w:rPr>
-                <w:rFonts w:ascii="Arial" w:hAnsi="Arial"/>
-                <w:sz w:val="18"/>
-              </w:rPr>
-              <w:t>-0.000</w:t>
-            </w:r>
-          </w:p>
-        </w:tc>
-        <w:tc>
-          <w:tcPr>
-            <w:tcW w:type="dxa" w:w="864"/>
-          </w:tcPr>
-          <w:p>
-            <w:r>
-              <w:rPr>
-                <w:rFonts w:ascii="Arial" w:hAnsi="Arial"/>
-                <w:sz w:val="18"/>
-              </w:rPr>
-              <w:t>0.000</w:t>
-            </w:r>
-          </w:p>
-        </w:tc>
-        <w:tc>
-          <w:tcPr>
-            <w:tcW w:type="dxa" w:w="864"/>
-          </w:tcPr>
-          <w:p>
-            <w:r>
-              <w:rPr>
-                <w:rFonts w:ascii="Arial" w:hAnsi="Arial"/>
-                <w:sz w:val="18"/>
-              </w:rPr>
-              <w:t>nan</w:t>
+              <w:t>-0.065</w:t>
+            </w:r>
+          </w:p>
+        </w:tc>
+        <w:tc>
+          <w:tcPr>
+            <w:tcW w:type="dxa" w:w="864"/>
+          </w:tcPr>
+          <w:p>
+            <w:r>
+              <w:rPr>
+                <w:rFonts w:ascii="Arial" w:hAnsi="Arial"/>
+                <w:sz w:val="18"/>
+              </w:rPr>
+              <w:t>0.078</w:t>
+            </w:r>
+          </w:p>
+        </w:tc>
+        <w:tc>
+          <w:tcPr>
+            <w:tcW w:type="dxa" w:w="864"/>
+          </w:tcPr>
+          <w:p>
+            <w:r>
+              <w:rPr>
+                <w:rFonts w:ascii="Arial" w:hAnsi="Arial"/>
+                <w:sz w:val="18"/>
+              </w:rPr>
+              <w:t>0.400</w:t>
+            </w:r>
+          </w:p>
+        </w:tc>
+        <w:tc>
+          <w:tcPr>
+            <w:tcW w:type="dxa" w:w="864"/>
+          </w:tcPr>
+          <w:p>
+            <w:r>
+              <w:rPr>
+                <w:rFonts w:ascii="Arial" w:hAnsi="Arial"/>
+                <w:sz w:val="18"/>
+              </w:rPr>
+              <w:t>-0.217</w:t>
+            </w:r>
+          </w:p>
+        </w:tc>
+        <w:tc>
+          <w:tcPr>
+            <w:tcW w:type="dxa" w:w="864"/>
+          </w:tcPr>
+          <w:p>
+            <w:r>
+              <w:rPr>
+                <w:rFonts w:ascii="Arial" w:hAnsi="Arial"/>
+                <w:sz w:val="18"/>
+              </w:rPr>
+              <w:t>0.087</w:t>
+            </w:r>
+          </w:p>
+        </w:tc>
+        <w:tc>
+          <w:tcPr>
+            <w:tcW w:type="dxa" w:w="864"/>
+          </w:tcPr>
+          <w:p>
+            <w:r>
+              <w:rPr>
+                <w:rFonts w:ascii="Arial" w:hAnsi="Arial"/>
+                <w:sz w:val="18"/>
+              </w:rPr>
+              <w:t>33.300</w:t>
             </w:r>
           </w:p>
         </w:tc>
@@ -7279,7 +7279,63 @@
                 <w:rFonts w:ascii="Arial" w:hAnsi="Arial"/>
                 <w:sz w:val="18"/>
               </w:rPr>
-              <w:t>+0.000</w:t>
+              <w:t>-0.098</w:t>
+            </w:r>
+          </w:p>
+        </w:tc>
+        <w:tc>
+          <w:tcPr>
+            <w:tcW w:type="dxa" w:w="864"/>
+          </w:tcPr>
+          <w:p>
+            <w:r>
+              <w:rPr>
+                <w:rFonts w:ascii="Arial" w:hAnsi="Arial"/>
+                <w:sz w:val="18"/>
+              </w:rPr>
+              <w:t>0.061</w:t>
+            </w:r>
+          </w:p>
+        </w:tc>
+        <w:tc>
+          <w:tcPr>
+            <w:tcW w:type="dxa" w:w="864"/>
+          </w:tcPr>
+          <w:p>
+            <w:r>
+              <w:rPr>
+                <w:rFonts w:ascii="Arial" w:hAnsi="Arial"/>
+                <w:sz w:val="18"/>
+              </w:rPr>
+              <w:t>0.111</w:t>
+            </w:r>
+          </w:p>
+        </w:tc>
+        <w:tc>
+          <w:tcPr>
+            <w:tcW w:type="dxa" w:w="864"/>
+          </w:tcPr>
+          <w:p>
+            <w:r>
+              <w:rPr>
+                <w:rFonts w:ascii="Arial" w:hAnsi="Arial"/>
+                <w:sz w:val="18"/>
+              </w:rPr>
+              <w:t>-0.218</w:t>
+            </w:r>
+          </w:p>
+        </w:tc>
+        <w:tc>
+          <w:tcPr>
+            <w:tcW w:type="dxa" w:w="864"/>
+          </w:tcPr>
+          <w:p>
+            <w:r>
+              <w:rPr>
+                <w:rFonts w:ascii="Arial" w:hAnsi="Arial"/>
+                <w:sz w:val="18"/>
+              </w:rPr>
+              <w:t>0.023</w:t>
             </w:r>
           </w:p>
         </w:tc>
@@ -7294,62 +7350,6 @@
                 <w:sz w:val="18"/>
               </w:rPr>
               <w:t>0.000</w:t>
-            </w:r>
-          </w:p>
-        </w:tc>
-        <w:tc>
-          <w:tcPr>
-            <w:tcW w:type="dxa" w:w="864"/>
-          </w:tcPr>
-          <w:p>
-            <w:r>
-              <w:rPr>
-                <w:rFonts w:ascii="Arial" w:hAnsi="Arial"/>
-                <w:sz w:val="18"/>
-              </w:rPr>
-              <w:t>0.141</w:t>
-            </w:r>
-          </w:p>
-        </w:tc>
-        <w:tc>
-          <w:tcPr>
-            <w:tcW w:type="dxa" w:w="864"/>
-          </w:tcPr>
-          <w:p>
-            <w:r>
-              <w:rPr>
-                <w:rFonts w:ascii="Arial" w:hAnsi="Arial"/>
-                <w:sz w:val="18"/>
-              </w:rPr>
-              <w:t>-0.000</w:t>
-            </w:r>
-          </w:p>
-        </w:tc>
-        <w:tc>
-          <w:tcPr>
-            <w:tcW w:type="dxa" w:w="864"/>
-          </w:tcPr>
-          <w:p>
-            <w:r>
-              <w:rPr>
-                <w:rFonts w:ascii="Arial" w:hAnsi="Arial"/>
-                <w:sz w:val="18"/>
-              </w:rPr>
-              <w:t>0.000</w:t>
-            </w:r>
-          </w:p>
-        </w:tc>
-        <w:tc>
-          <w:tcPr>
-            <w:tcW w:type="dxa" w:w="864"/>
-          </w:tcPr>
-          <w:p>
-            <w:r>
-              <w:rPr>
-                <w:rFonts w:ascii="Arial" w:hAnsi="Arial"/>
-                <w:sz w:val="18"/>
-              </w:rPr>
-              <w:t>nan</w:t>
             </w:r>
           </w:p>
         </w:tc>
@@ -7421,77 +7421,77 @@
                 <w:rFonts w:ascii="Arial" w:hAnsi="Arial"/>
                 <w:sz w:val="18"/>
               </w:rPr>
-              <w:t>-0.000</w:t>
-            </w:r>
-          </w:p>
-        </w:tc>
-        <w:tc>
-          <w:tcPr>
-            <w:tcW w:type="dxa" w:w="864"/>
-          </w:tcPr>
-          <w:p>
-            <w:r>
-              <w:rPr>
-                <w:rFonts w:ascii="Arial" w:hAnsi="Arial"/>
-                <w:sz w:val="18"/>
-              </w:rPr>
-              <w:t>0.000</w:t>
-            </w:r>
-          </w:p>
-        </w:tc>
-        <w:tc>
-          <w:tcPr>
-            <w:tcW w:type="dxa" w:w="864"/>
-          </w:tcPr>
-          <w:p>
-            <w:r>
-              <w:rPr>
-                <w:rFonts w:ascii="Arial" w:hAnsi="Arial"/>
-                <w:sz w:val="18"/>
-              </w:rPr>
-              <w:t>0.396</w:t>
-            </w:r>
-          </w:p>
-        </w:tc>
-        <w:tc>
-          <w:tcPr>
-            <w:tcW w:type="dxa" w:w="864"/>
-          </w:tcPr>
-          <w:p>
-            <w:r>
-              <w:rPr>
-                <w:rFonts w:ascii="Arial" w:hAnsi="Arial"/>
-                <w:sz w:val="18"/>
-              </w:rPr>
-              <w:t>-0.000</w:t>
-            </w:r>
-          </w:p>
-        </w:tc>
-        <w:tc>
-          <w:tcPr>
-            <w:tcW w:type="dxa" w:w="864"/>
-          </w:tcPr>
-          <w:p>
-            <w:r>
-              <w:rPr>
-                <w:rFonts w:ascii="Arial" w:hAnsi="Arial"/>
-                <w:sz w:val="18"/>
-              </w:rPr>
-              <w:t>0.000</w:t>
-            </w:r>
-          </w:p>
-        </w:tc>
-        <w:tc>
-          <w:tcPr>
-            <w:tcW w:type="dxa" w:w="864"/>
-          </w:tcPr>
-          <w:p>
-            <w:r>
-              <w:rPr>
-                <w:rFonts w:ascii="Arial" w:hAnsi="Arial"/>
-                <w:sz w:val="18"/>
-              </w:rPr>
-              <w:t>nan</w:t>
+              <w:t>-0.100</w:t>
+            </w:r>
+          </w:p>
+        </w:tc>
+        <w:tc>
+          <w:tcPr>
+            <w:tcW w:type="dxa" w:w="864"/>
+          </w:tcPr>
+          <w:p>
+            <w:r>
+              <w:rPr>
+                <w:rFonts w:ascii="Arial" w:hAnsi="Arial"/>
+                <w:sz w:val="18"/>
+              </w:rPr>
+              <w:t>0.065</w:t>
+            </w:r>
+          </w:p>
+        </w:tc>
+        <w:tc>
+          <w:tcPr>
+            <w:tcW w:type="dxa" w:w="864"/>
+          </w:tcPr>
+          <w:p>
+            <w:r>
+              <w:rPr>
+                <w:rFonts w:ascii="Arial" w:hAnsi="Arial"/>
+                <w:sz w:val="18"/>
+              </w:rPr>
+              <w:t>0.127</w:t>
+            </w:r>
+          </w:p>
+        </w:tc>
+        <w:tc>
+          <w:tcPr>
+            <w:tcW w:type="dxa" w:w="864"/>
+          </w:tcPr>
+          <w:p>
+            <w:r>
+              <w:rPr>
+                <w:rFonts w:ascii="Arial" w:hAnsi="Arial"/>
+                <w:sz w:val="18"/>
+              </w:rPr>
+              <w:t>-0.228</w:t>
+            </w:r>
+          </w:p>
+        </w:tc>
+        <w:tc>
+          <w:tcPr>
+            <w:tcW w:type="dxa" w:w="864"/>
+          </w:tcPr>
+          <w:p>
+            <w:r>
+              <w:rPr>
+                <w:rFonts w:ascii="Arial" w:hAnsi="Arial"/>
+                <w:sz w:val="18"/>
+              </w:rPr>
+              <w:t>0.028</w:t>
+            </w:r>
+          </w:p>
+        </w:tc>
+        <w:tc>
+          <w:tcPr>
+            <w:tcW w:type="dxa" w:w="864"/>
+          </w:tcPr>
+          <w:p>
+            <w:r>
+              <w:rPr>
+                <w:rFonts w:ascii="Arial" w:hAnsi="Arial"/>
+                <w:sz w:val="18"/>
+              </w:rPr>
+              <w:t>-2.000</w:t>
             </w:r>
           </w:p>
         </w:tc>
@@ -7563,77 +7563,77 @@
                 <w:rFonts w:ascii="Arial" w:hAnsi="Arial"/>
                 <w:sz w:val="18"/>
               </w:rPr>
-              <w:t>+0.000</w:t>
-            </w:r>
-          </w:p>
-        </w:tc>
-        <w:tc>
-          <w:tcPr>
-            <w:tcW w:type="dxa" w:w="864"/>
-          </w:tcPr>
-          <w:p>
-            <w:r>
-              <w:rPr>
-                <w:rFonts w:ascii="Arial" w:hAnsi="Arial"/>
-                <w:sz w:val="18"/>
-              </w:rPr>
-              <w:t>0.000</w:t>
-            </w:r>
-          </w:p>
-        </w:tc>
-        <w:tc>
-          <w:tcPr>
-            <w:tcW w:type="dxa" w:w="864"/>
-          </w:tcPr>
-          <w:p>
-            <w:r>
-              <w:rPr>
-                <w:rFonts w:ascii="Arial" w:hAnsi="Arial"/>
-                <w:sz w:val="18"/>
-              </w:rPr>
-              <w:t>1.000</w:t>
-            </w:r>
-          </w:p>
-        </w:tc>
-        <w:tc>
-          <w:tcPr>
-            <w:tcW w:type="dxa" w:w="864"/>
-          </w:tcPr>
-          <w:p>
-            <w:r>
-              <w:rPr>
-                <w:rFonts w:ascii="Arial" w:hAnsi="Arial"/>
-                <w:sz w:val="18"/>
-              </w:rPr>
-              <w:t>-0.000</w:t>
-            </w:r>
-          </w:p>
-        </w:tc>
-        <w:tc>
-          <w:tcPr>
-            <w:tcW w:type="dxa" w:w="864"/>
-          </w:tcPr>
-          <w:p>
-            <w:r>
-              <w:rPr>
-                <w:rFonts w:ascii="Arial" w:hAnsi="Arial"/>
-                <w:sz w:val="18"/>
-              </w:rPr>
-              <w:t>0.000</w:t>
-            </w:r>
-          </w:p>
-        </w:tc>
-        <w:tc>
-          <w:tcPr>
-            <w:tcW w:type="dxa" w:w="864"/>
-          </w:tcPr>
-          <w:p>
-            <w:r>
-              <w:rPr>
-                <w:rFonts w:ascii="Arial" w:hAnsi="Arial"/>
-                <w:sz w:val="18"/>
-              </w:rPr>
-              <w:t>nan</w:t>
+              <w:t>-0.088</w:t>
+            </w:r>
+          </w:p>
+        </w:tc>
+        <w:tc>
+          <w:tcPr>
+            <w:tcW w:type="dxa" w:w="864"/>
+          </w:tcPr>
+          <w:p>
+            <w:r>
+              <w:rPr>
+                <w:rFonts w:ascii="Arial" w:hAnsi="Arial"/>
+                <w:sz w:val="18"/>
+              </w:rPr>
+              <w:t>0.087</w:t>
+            </w:r>
+          </w:p>
+        </w:tc>
+        <w:tc>
+          <w:tcPr>
+            <w:tcW w:type="dxa" w:w="864"/>
+          </w:tcPr>
+          <w:p>
+            <w:r>
+              <w:rPr>
+                <w:rFonts w:ascii="Arial" w:hAnsi="Arial"/>
+                <w:sz w:val="18"/>
+              </w:rPr>
+              <w:t>0.310</w:t>
+            </w:r>
+          </w:p>
+        </w:tc>
+        <w:tc>
+          <w:tcPr>
+            <w:tcW w:type="dxa" w:w="864"/>
+          </w:tcPr>
+          <w:p>
+            <w:r>
+              <w:rPr>
+                <w:rFonts w:ascii="Arial" w:hAnsi="Arial"/>
+                <w:sz w:val="18"/>
+              </w:rPr>
+              <w:t>-0.257</w:t>
+            </w:r>
+          </w:p>
+        </w:tc>
+        <w:tc>
+          <w:tcPr>
+            <w:tcW w:type="dxa" w:w="864"/>
+          </w:tcPr>
+          <w:p>
+            <w:r>
+              <w:rPr>
+                <w:rFonts w:ascii="Arial" w:hAnsi="Arial"/>
+                <w:sz w:val="18"/>
+              </w:rPr>
+              <w:t>0.082</w:t>
+            </w:r>
+          </w:p>
+        </w:tc>
+        <w:tc>
+          <w:tcPr>
+            <w:tcW w:type="dxa" w:w="864"/>
+          </w:tcPr>
+          <w:p>
+            <w:r>
+              <w:rPr>
+                <w:rFonts w:ascii="Arial" w:hAnsi="Arial"/>
+                <w:sz w:val="18"/>
+              </w:rPr>
+              <w:t>10.300</w:t>
             </w:r>
           </w:p>
         </w:tc>

</xml_diff>